<commit_message>
enhance: update doc and markdown resume
</commit_message>
<xml_diff>
--- a/assets/docs/Mehedi_Hasan_Resume.docx
+++ b/assets/docs/Mehedi_Hasan_Resume.docx
@@ -4,77 +4,137 @@
   <w:body>
     <w:p>
       <w:pPr>
+        <w:keepNext/>
+        <w:spacing w:before="0" w:after="20" w:lineRule="exact" w:line="450"/>
         <w:jc w:val="center"/>
       </w:pPr>
       <w:r>
         <w:rPr>
+          <w:rFonts w:ascii="Calibri" w:hAnsi="Calibri" w:eastAsia="Calibri" w:cs="Calibri"/>
           <w:b/>
-          <w:sz w:val="40"/>
+          <w:i w:val="0"/>
+          <w:color w:val="0E4661"/>
+          <w:sz w:val="41"/>
         </w:rPr>
-        <w:t>MEHEDI HASAN</w:t>
+        <w:t>Mehedi Hasan</w:t>
       </w:r>
     </w:p>
     <w:p>
       <w:pPr>
+        <w:keepNext/>
+        <w:spacing w:before="0" w:after="140" w:lineRule="exact" w:line="240"/>
         <w:jc w:val="center"/>
       </w:pPr>
       <w:r>
         <w:rPr>
-          <w:sz w:val="20"/>
+          <w:rFonts w:ascii="Calibri" w:hAnsi="Calibri" w:eastAsia="Calibri" w:cs="Calibri"/>
+          <w:b w:val="0"/>
+          <w:i w:val="0"/>
+          <w:color w:val="0E4661"/>
+          <w:sz w:val="21"/>
         </w:rPr>
-        <w:t>Dhaka, Bangladesh | +8801621640037 | mdmehedi03@gmail.com</w:t>
-        <w:br/>
-        <w:t>LinkedIn: linkedin.com/in/mehedisoft | GitHub: mehedihasan03.github.io</w:t>
-      </w:r>
-    </w:p>
-    <w:p>
-      <w:pPr>
-        <w:pStyle w:val="Heading1"/>
-      </w:pPr>
-      <w:r>
-        <w:t>Professional Summary</w:t>
-      </w:r>
-    </w:p>
-    <w:p>
-      <w:r>
-        <w:t>Senior Java Backend Developer with 3+ years of experience building scalable fintech and banking applications using Java, Spring Boot, Spring WebFlux, PostgreSQL, and Oracle. Experienced in reactive programming, microservices architecture, multi-tenant systems, API optimization, and backend performance tuning. Strong expertise in banking domain solutions including NID Verification Systems, Islamic Core Banking, Agent Banking, and Microfinance platforms. Skilled in Docker, Git, Jenkins, and modern backend engineering practices.</w:t>
-      </w:r>
-    </w:p>
-    <w:p>
-      <w:pPr>
-        <w:pStyle w:val="Heading1"/>
-      </w:pPr>
-      <w:r>
-        <w:t>Technical Skills</w:t>
+        <w:t>Java Backend Engineer | Spring Boot | WebFlux | Fintech</w:t>
       </w:r>
     </w:p>
     <w:tbl>
       <w:tblPr>
         <w:tblW w:type="auto" w:w="0"/>
+        <w:jc w:val="left"/>
+        <w:tblLayout w:type="fixed"/>
         <w:tblLook w:firstColumn="1" w:firstRow="1" w:lastColumn="0" w:lastRow="0" w:noHBand="0" w:noVBand="1" w:val="04A0"/>
+        <w:tblBorders>
+          <w:top w:val="nil"/>
+          <w:left w:val="nil"/>
+          <w:bottom w:val="nil"/>
+          <w:right w:val="nil"/>
+          <w:insideH w:val="nil"/>
+          <w:insideV w:val="nil"/>
+        </w:tblBorders>
       </w:tblPr>
       <w:tblGrid>
-        <w:gridCol w:w="4320"/>
-        <w:gridCol w:w="4320"/>
+        <w:gridCol w:w="274"/>
+        <w:gridCol w:w="10368"/>
       </w:tblGrid>
       <w:tr>
         <w:tc>
           <w:tcPr>
-            <w:tcW w:type="dxa" w:w="4320"/>
+            <w:tcW w:type="dxa" w:w="274"/>
+            <w:vAlign w:val="center"/>
+            <w:tcMar>
+              <w:top w:w="0" w:type="dxa"/>
+              <w:start w:w="0" w:type="dxa"/>
+              <w:bottom w:w="0" w:type="dxa"/>
+              <w:end w:w="0" w:type="dxa"/>
+            </w:tcMar>
           </w:tcPr>
           <w:p>
+            <w:pPr>
+              <w:keepNext w:val="0"/>
+              <w:spacing w:before="0" w:after="0" w:lineRule="exact" w:line="264"/>
+              <w:jc w:val="left"/>
+            </w:pPr>
             <w:r>
-              <w:t>Category</w:t>
+              <w:drawing>
+                <wp:inline xmlns:a="http://schemas.openxmlformats.org/drawingml/2006/main" xmlns:pic="http://schemas.openxmlformats.org/drawingml/2006/picture">
+                  <wp:extent cx="109728" cy="109728"/>
+                  <wp:docPr id="1" name="Picture 1"/>
+                  <wp:cNvGraphicFramePr>
+                    <a:graphicFrameLocks noChangeAspect="1"/>
+                  </wp:cNvGraphicFramePr>
+                  <a:graphic>
+                    <a:graphicData uri="http://schemas.openxmlformats.org/drawingml/2006/picture">
+                      <pic:pic>
+                        <pic:nvPicPr>
+                          <pic:cNvPr id="0" name="image.png"/>
+                          <pic:cNvPicPr/>
+                        </pic:nvPicPr>
+                        <pic:blipFill>
+                          <a:blip r:embed="rId9"/>
+                          <a:stretch>
+                            <a:fillRect/>
+                          </a:stretch>
+                        </pic:blipFill>
+                        <pic:spPr>
+                          <a:xfrm>
+                            <a:off x="0" y="0"/>
+                            <a:ext cx="109728" cy="109728"/>
+                          </a:xfrm>
+                          <a:prstGeom prst="rect"/>
+                        </pic:spPr>
+                      </pic:pic>
+                    </a:graphicData>
+                  </a:graphic>
+                </wp:inline>
+              </w:drawing>
             </w:r>
           </w:p>
         </w:tc>
         <w:tc>
           <w:tcPr>
-            <w:tcW w:type="dxa" w:w="4320"/>
+            <w:tcW w:type="dxa" w:w="10368"/>
+            <w:vAlign w:val="center"/>
+            <w:tcMar>
+              <w:top w:w="0" w:type="dxa"/>
+              <w:start w:w="35" w:type="dxa"/>
+              <w:bottom w:w="0" w:type="dxa"/>
+              <w:end w:w="0" w:type="dxa"/>
+            </w:tcMar>
           </w:tcPr>
           <w:p>
+            <w:pPr>
+              <w:keepNext w:val="0"/>
+              <w:spacing w:before="0" w:after="0" w:lineRule="exact" w:line="264"/>
+              <w:jc w:val="left"/>
+            </w:pPr>
             <w:r>
-              <w:t>Technologies</w:t>
+              <w:rPr>
+                <w:rFonts w:ascii="Calibri" w:hAnsi="Calibri" w:eastAsia="Calibri" w:cs="Calibri"/>
+                <w:b w:val="0"/>
+                <w:i w:val="0"/>
+                <w:color w:val="000000"/>
+                <w:sz w:val="22"/>
+              </w:rPr>
+              <w:t>+880 1621-640037 | +880 1835-233447</w:t>
             </w:r>
           </w:p>
         </w:tc>
@@ -82,416 +142,2023 @@
       <w:tr>
         <w:tc>
           <w:tcPr>
-            <w:tcW w:type="dxa" w:w="4320"/>
+            <w:tcW w:type="dxa" w:w="274"/>
+            <w:vAlign w:val="center"/>
+            <w:tcMar>
+              <w:top w:w="0" w:type="dxa"/>
+              <w:start w:w="0" w:type="dxa"/>
+              <w:bottom w:w="0" w:type="dxa"/>
+              <w:end w:w="0" w:type="dxa"/>
+            </w:tcMar>
           </w:tcPr>
           <w:p>
+            <w:pPr>
+              <w:keepNext w:val="0"/>
+              <w:spacing w:before="0" w:after="0" w:lineRule="exact" w:line="264"/>
+              <w:jc w:val="left"/>
+            </w:pPr>
             <w:r>
-              <w:t>Languages</w:t>
+              <w:drawing>
+                <wp:inline xmlns:a="http://schemas.openxmlformats.org/drawingml/2006/main" xmlns:pic="http://schemas.openxmlformats.org/drawingml/2006/picture">
+                  <wp:extent cx="109728" cy="109728"/>
+                  <wp:docPr id="2" name="Picture 2"/>
+                  <wp:cNvGraphicFramePr>
+                    <a:graphicFrameLocks noChangeAspect="1"/>
+                  </wp:cNvGraphicFramePr>
+                  <a:graphic>
+                    <a:graphicData uri="http://schemas.openxmlformats.org/drawingml/2006/picture">
+                      <pic:pic>
+                        <pic:nvPicPr>
+                          <pic:cNvPr id="0" name="image.png"/>
+                          <pic:cNvPicPr/>
+                        </pic:nvPicPr>
+                        <pic:blipFill>
+                          <a:blip r:embed="rId10"/>
+                          <a:stretch>
+                            <a:fillRect/>
+                          </a:stretch>
+                        </pic:blipFill>
+                        <pic:spPr>
+                          <a:xfrm>
+                            <a:off x="0" y="0"/>
+                            <a:ext cx="109728" cy="109728"/>
+                          </a:xfrm>
+                          <a:prstGeom prst="rect"/>
+                        </pic:spPr>
+                      </pic:pic>
+                    </a:graphicData>
+                  </a:graphic>
+                </wp:inline>
+              </w:drawing>
             </w:r>
           </w:p>
         </w:tc>
         <w:tc>
           <w:tcPr>
-            <w:tcW w:type="dxa" w:w="4320"/>
+            <w:tcW w:type="dxa" w:w="10368"/>
+            <w:vAlign w:val="center"/>
+            <w:tcMar>
+              <w:top w:w="0" w:type="dxa"/>
+              <w:start w:w="35" w:type="dxa"/>
+              <w:bottom w:w="0" w:type="dxa"/>
+              <w:end w:w="0" w:type="dxa"/>
+            </w:tcMar>
           </w:tcPr>
           <w:p>
-            <w:r>
-              <w:t>Java, SQL, C# (Basic)</w:t>
-            </w:r>
+            <w:pPr>
+              <w:keepNext w:val="0"/>
+              <w:spacing w:before="0" w:after="0" w:lineRule="exact" w:line="264"/>
+              <w:jc w:val="left"/>
+            </w:pPr>
+            <w:hyperlink r:id="rId11">
+              <w:r>
+                <w:rPr>
+                  <w:rFonts w:ascii="Calibri" w:hAnsi="Calibri" w:eastAsia="Calibri" w:cs="Calibri"/>
+                  <w:color w:val="1154CC"/>
+                  <w:sz w:val="22"/>
+                  <w:szCs w:val="22"/>
+                  <w:u w:val="none"/>
+                </w:rPr>
+                <w:t>mdmehedi03@gmail.com</w:t>
+              </w:r>
+            </w:hyperlink>
           </w:p>
         </w:tc>
       </w:tr>
       <w:tr>
         <w:tc>
           <w:tcPr>
-            <w:tcW w:type="dxa" w:w="4320"/>
+            <w:tcW w:type="dxa" w:w="274"/>
+            <w:vAlign w:val="center"/>
+            <w:tcMar>
+              <w:top w:w="0" w:type="dxa"/>
+              <w:start w:w="0" w:type="dxa"/>
+              <w:bottom w:w="0" w:type="dxa"/>
+              <w:end w:w="0" w:type="dxa"/>
+            </w:tcMar>
           </w:tcPr>
           <w:p>
+            <w:pPr>
+              <w:keepNext w:val="0"/>
+              <w:spacing w:before="0" w:after="0" w:lineRule="exact" w:line="264"/>
+              <w:jc w:val="left"/>
+            </w:pPr>
             <w:r>
-              <w:t>Frameworks</w:t>
+              <w:drawing>
+                <wp:inline xmlns:a="http://schemas.openxmlformats.org/drawingml/2006/main" xmlns:pic="http://schemas.openxmlformats.org/drawingml/2006/picture">
+                  <wp:extent cx="109728" cy="109728"/>
+                  <wp:docPr id="3" name="Picture 3"/>
+                  <wp:cNvGraphicFramePr>
+                    <a:graphicFrameLocks noChangeAspect="1"/>
+                  </wp:cNvGraphicFramePr>
+                  <a:graphic>
+                    <a:graphicData uri="http://schemas.openxmlformats.org/drawingml/2006/picture">
+                      <pic:pic>
+                        <pic:nvPicPr>
+                          <pic:cNvPr id="0" name="image.png"/>
+                          <pic:cNvPicPr/>
+                        </pic:nvPicPr>
+                        <pic:blipFill>
+                          <a:blip r:embed="rId12"/>
+                          <a:stretch>
+                            <a:fillRect/>
+                          </a:stretch>
+                        </pic:blipFill>
+                        <pic:spPr>
+                          <a:xfrm>
+                            <a:off x="0" y="0"/>
+                            <a:ext cx="109728" cy="109728"/>
+                          </a:xfrm>
+                          <a:prstGeom prst="rect"/>
+                        </pic:spPr>
+                      </pic:pic>
+                    </a:graphicData>
+                  </a:graphic>
+                </wp:inline>
+              </w:drawing>
             </w:r>
           </w:p>
         </w:tc>
         <w:tc>
           <w:tcPr>
-            <w:tcW w:type="dxa" w:w="4320"/>
+            <w:tcW w:type="dxa" w:w="10368"/>
+            <w:vAlign w:val="center"/>
+            <w:tcMar>
+              <w:top w:w="0" w:type="dxa"/>
+              <w:start w:w="35" w:type="dxa"/>
+              <w:bottom w:w="0" w:type="dxa"/>
+              <w:end w:w="0" w:type="dxa"/>
+            </w:tcMar>
           </w:tcPr>
           <w:p>
+            <w:pPr>
+              <w:keepNext w:val="0"/>
+              <w:spacing w:before="0" w:after="0" w:lineRule="exact" w:line="264"/>
+              <w:jc w:val="left"/>
+            </w:pPr>
             <w:r>
-              <w:t>Spring Boot, Spring WebFlux, Spring Security, Spring MVC, Hibernate, JPA</w:t>
+              <w:rPr>
+                <w:rFonts w:ascii="Calibri" w:hAnsi="Calibri" w:eastAsia="Calibri" w:cs="Calibri"/>
+                <w:b w:val="0"/>
+                <w:i w:val="0"/>
+                <w:color w:val="000000"/>
+                <w:sz w:val="22"/>
+              </w:rPr>
+              <w:t xml:space="preserve">LinkedIn: </w:t>
             </w:r>
+            <w:hyperlink r:id="rId13">
+              <w:r>
+                <w:rPr>
+                  <w:rFonts w:ascii="Calibri" w:hAnsi="Calibri" w:eastAsia="Calibri" w:cs="Calibri"/>
+                  <w:color w:val="1154CC"/>
+                  <w:sz w:val="22"/>
+                  <w:szCs w:val="22"/>
+                  <w:u w:val="none"/>
+                </w:rPr>
+                <w:t>https://www.linkedin.com/in/mehedisoft/</w:t>
+              </w:r>
+            </w:hyperlink>
           </w:p>
         </w:tc>
       </w:tr>
       <w:tr>
         <w:tc>
           <w:tcPr>
-            <w:tcW w:type="dxa" w:w="4320"/>
+            <w:tcW w:type="dxa" w:w="274"/>
+            <w:vAlign w:val="center"/>
+            <w:tcMar>
+              <w:top w:w="0" w:type="dxa"/>
+              <w:start w:w="0" w:type="dxa"/>
+              <w:bottom w:w="0" w:type="dxa"/>
+              <w:end w:w="0" w:type="dxa"/>
+            </w:tcMar>
           </w:tcPr>
           <w:p>
+            <w:pPr>
+              <w:keepNext w:val="0"/>
+              <w:spacing w:before="0" w:after="0" w:lineRule="exact" w:line="264"/>
+              <w:jc w:val="left"/>
+            </w:pPr>
             <w:r>
-              <w:t>Databases</w:t>
+              <w:drawing>
+                <wp:inline xmlns:a="http://schemas.openxmlformats.org/drawingml/2006/main" xmlns:pic="http://schemas.openxmlformats.org/drawingml/2006/picture">
+                  <wp:extent cx="109728" cy="109728"/>
+                  <wp:docPr id="4" name="Picture 4"/>
+                  <wp:cNvGraphicFramePr>
+                    <a:graphicFrameLocks noChangeAspect="1"/>
+                  </wp:cNvGraphicFramePr>
+                  <a:graphic>
+                    <a:graphicData uri="http://schemas.openxmlformats.org/drawingml/2006/picture">
+                      <pic:pic>
+                        <pic:nvPicPr>
+                          <pic:cNvPr id="0" name="image.png"/>
+                          <pic:cNvPicPr/>
+                        </pic:nvPicPr>
+                        <pic:blipFill>
+                          <a:blip r:embed="rId12"/>
+                          <a:stretch>
+                            <a:fillRect/>
+                          </a:stretch>
+                        </pic:blipFill>
+                        <pic:spPr>
+                          <a:xfrm>
+                            <a:off x="0" y="0"/>
+                            <a:ext cx="109728" cy="109728"/>
+                          </a:xfrm>
+                          <a:prstGeom prst="rect"/>
+                        </pic:spPr>
+                      </pic:pic>
+                    </a:graphicData>
+                  </a:graphic>
+                </wp:inline>
+              </w:drawing>
             </w:r>
           </w:p>
         </w:tc>
         <w:tc>
           <w:tcPr>
-            <w:tcW w:type="dxa" w:w="4320"/>
+            <w:tcW w:type="dxa" w:w="10368"/>
+            <w:vAlign w:val="center"/>
+            <w:tcMar>
+              <w:top w:w="0" w:type="dxa"/>
+              <w:start w:w="35" w:type="dxa"/>
+              <w:bottom w:w="0" w:type="dxa"/>
+              <w:end w:w="0" w:type="dxa"/>
+            </w:tcMar>
           </w:tcPr>
           <w:p>
+            <w:pPr>
+              <w:keepNext w:val="0"/>
+              <w:spacing w:before="0" w:after="0" w:lineRule="exact" w:line="264"/>
+              <w:jc w:val="left"/>
+            </w:pPr>
             <w:r>
-              <w:t>PostgreSQL, Oracle, MySQL, Oracle R2DBC</w:t>
+              <w:rPr>
+                <w:rFonts w:ascii="Calibri" w:hAnsi="Calibri" w:eastAsia="Calibri" w:cs="Calibri"/>
+                <w:b w:val="0"/>
+                <w:i w:val="0"/>
+                <w:color w:val="000000"/>
+                <w:sz w:val="22"/>
+              </w:rPr>
+              <w:t xml:space="preserve">Github: </w:t>
             </w:r>
+            <w:hyperlink r:id="rId14">
+              <w:r>
+                <w:rPr>
+                  <w:rFonts w:ascii="Calibri" w:hAnsi="Calibri" w:eastAsia="Calibri" w:cs="Calibri"/>
+                  <w:color w:val="1154CC"/>
+                  <w:sz w:val="22"/>
+                  <w:szCs w:val="22"/>
+                  <w:u w:val="none"/>
+                </w:rPr>
+                <w:t>https://github.com/mehedihasan03</w:t>
+              </w:r>
+            </w:hyperlink>
           </w:p>
         </w:tc>
       </w:tr>
       <w:tr>
         <w:tc>
           <w:tcPr>
-            <w:tcW w:type="dxa" w:w="4320"/>
+            <w:tcW w:type="dxa" w:w="274"/>
+            <w:vAlign w:val="center"/>
+            <w:tcMar>
+              <w:top w:w="0" w:type="dxa"/>
+              <w:start w:w="0" w:type="dxa"/>
+              <w:bottom w:w="0" w:type="dxa"/>
+              <w:end w:w="0" w:type="dxa"/>
+            </w:tcMar>
           </w:tcPr>
           <w:p>
+            <w:pPr>
+              <w:keepNext w:val="0"/>
+              <w:spacing w:before="0" w:after="0" w:lineRule="exact" w:line="264"/>
+              <w:jc w:val="left"/>
+            </w:pPr>
             <w:r>
-              <w:t>Frontend</w:t>
+              <w:drawing>
+                <wp:inline xmlns:a="http://schemas.openxmlformats.org/drawingml/2006/main" xmlns:pic="http://schemas.openxmlformats.org/drawingml/2006/picture">
+                  <wp:extent cx="109728" cy="109728"/>
+                  <wp:docPr id="5" name="Picture 5"/>
+                  <wp:cNvGraphicFramePr>
+                    <a:graphicFrameLocks noChangeAspect="1"/>
+                  </wp:cNvGraphicFramePr>
+                  <a:graphic>
+                    <a:graphicData uri="http://schemas.openxmlformats.org/drawingml/2006/picture">
+                      <pic:pic>
+                        <pic:nvPicPr>
+                          <pic:cNvPr id="0" name="image.png"/>
+                          <pic:cNvPicPr/>
+                        </pic:nvPicPr>
+                        <pic:blipFill>
+                          <a:blip r:embed="rId12"/>
+                          <a:stretch>
+                            <a:fillRect/>
+                          </a:stretch>
+                        </pic:blipFill>
+                        <pic:spPr>
+                          <a:xfrm>
+                            <a:off x="0" y="0"/>
+                            <a:ext cx="109728" cy="109728"/>
+                          </a:xfrm>
+                          <a:prstGeom prst="rect"/>
+                        </pic:spPr>
+                      </pic:pic>
+                    </a:graphicData>
+                  </a:graphic>
+                </wp:inline>
+              </w:drawing>
             </w:r>
           </w:p>
         </w:tc>
         <w:tc>
           <w:tcPr>
-            <w:tcW w:type="dxa" w:w="4320"/>
+            <w:tcW w:type="dxa" w:w="10368"/>
+            <w:vAlign w:val="center"/>
+            <w:tcMar>
+              <w:top w:w="0" w:type="dxa"/>
+              <w:start w:w="35" w:type="dxa"/>
+              <w:bottom w:w="0" w:type="dxa"/>
+              <w:end w:w="0" w:type="dxa"/>
+            </w:tcMar>
           </w:tcPr>
           <w:p>
+            <w:pPr>
+              <w:keepNext w:val="0"/>
+              <w:spacing w:before="0" w:after="0" w:lineRule="exact" w:line="264"/>
+              <w:jc w:val="left"/>
+            </w:pPr>
             <w:r>
-              <w:t>Angular, HTML, CSS</w:t>
+              <w:rPr>
+                <w:rFonts w:ascii="Calibri" w:hAnsi="Calibri" w:eastAsia="Calibri" w:cs="Calibri"/>
+                <w:b w:val="0"/>
+                <w:i w:val="0"/>
+                <w:color w:val="000000"/>
+                <w:sz w:val="22"/>
+              </w:rPr>
+              <w:t xml:space="preserve">Portfolio: </w:t>
             </w:r>
-          </w:p>
-        </w:tc>
-      </w:tr>
-      <w:tr>
-        <w:tc>
-          <w:tcPr>
-            <w:tcW w:type="dxa" w:w="4320"/>
-          </w:tcPr>
-          <w:p>
-            <w:r>
-              <w:t>Architecture</w:t>
-            </w:r>
-          </w:p>
-        </w:tc>
-        <w:tc>
-          <w:tcPr>
-            <w:tcW w:type="dxa" w:w="4320"/>
-          </w:tcPr>
-          <w:p>
-            <w:r>
-              <w:t>Reactive Programming, REST APIs, Microservices, Clean Architecture, Multi-Tenancy</w:t>
-            </w:r>
-          </w:p>
-        </w:tc>
-      </w:tr>
-      <w:tr>
-        <w:tc>
-          <w:tcPr>
-            <w:tcW w:type="dxa" w:w="4320"/>
-          </w:tcPr>
-          <w:p>
-            <w:r>
-              <w:t>DevOps &amp; Tools</w:t>
-            </w:r>
-          </w:p>
-        </w:tc>
-        <w:tc>
-          <w:tcPr>
-            <w:tcW w:type="dxa" w:w="4320"/>
-          </w:tcPr>
-          <w:p>
-            <w:r>
-              <w:t>Docker, Kubernetes (Basic), Jenkins, Git, GitLab, GitHub</w:t>
-            </w:r>
-          </w:p>
-        </w:tc>
-      </w:tr>
-      <w:tr>
-        <w:tc>
-          <w:tcPr>
-            <w:tcW w:type="dxa" w:w="4320"/>
-          </w:tcPr>
-          <w:p>
-            <w:r>
-              <w:t>Testing</w:t>
-            </w:r>
-          </w:p>
-        </w:tc>
-        <w:tc>
-          <w:tcPr>
-            <w:tcW w:type="dxa" w:w="4320"/>
-          </w:tcPr>
-          <w:p>
-            <w:r>
-              <w:t>JUnit, Mockito, Performance Testing</w:t>
-            </w:r>
-          </w:p>
-        </w:tc>
-      </w:tr>
-      <w:tr>
-        <w:tc>
-          <w:tcPr>
-            <w:tcW w:type="dxa" w:w="4320"/>
-          </w:tcPr>
-          <w:p>
-            <w:r>
-              <w:t>Reporting</w:t>
-            </w:r>
-          </w:p>
-        </w:tc>
-        <w:tc>
-          <w:tcPr>
-            <w:tcW w:type="dxa" w:w="4320"/>
-          </w:tcPr>
-          <w:p>
-            <w:r>
-              <w:t>Jasper Reports</w:t>
-            </w:r>
+            <w:hyperlink r:id="rId15">
+              <w:r>
+                <w:rPr>
+                  <w:rFonts w:ascii="Calibri" w:hAnsi="Calibri" w:eastAsia="Calibri" w:cs="Calibri"/>
+                  <w:color w:val="1154CC"/>
+                  <w:sz w:val="22"/>
+                  <w:szCs w:val="22"/>
+                  <w:u w:val="none"/>
+                </w:rPr>
+                <w:t>https://mehedihasan03.github.io/</w:t>
+              </w:r>
+            </w:hyperlink>
           </w:p>
         </w:tc>
       </w:tr>
     </w:tbl>
     <w:p>
       <w:pPr>
-        <w:pStyle w:val="Heading1"/>
+        <w:keepNext w:val="0"/>
+        <w:spacing w:before="0" w:after="100" w:lineRule="exact" w:line="50"/>
+        <w:jc w:val="left"/>
+        <w:pBdr>
+          <w:bottom w:val="single" w:sz="4" w:space="1" w:color="A6A6A6"/>
+        </w:pBdr>
+      </w:pPr>
+    </w:p>
+    <w:p>
+      <w:pPr>
+        <w:keepNext/>
+        <w:spacing w:before="0" w:after="60" w:lineRule="exact" w:line="290"/>
+        <w:jc w:val="left"/>
       </w:pPr>
       <w:r>
-        <w:t>Professional Experience</w:t>
+        <w:rPr>
+          <w:rFonts w:ascii="Calibri" w:hAnsi="Calibri" w:eastAsia="Calibri" w:cs="Calibri"/>
+          <w:b/>
+          <w:i w:val="0"/>
+          <w:color w:val="0E4661"/>
+          <w:sz w:val="25"/>
+        </w:rPr>
+        <w:t>Professional Summary</w:t>
+      </w:r>
+    </w:p>
+    <w:p>
+      <w:pPr>
+        <w:keepNext w:val="0"/>
+        <w:spacing w:before="0" w:after="40" w:lineRule="exact" w:line="268"/>
+        <w:jc w:val="both"/>
+      </w:pPr>
+      <w:r>
+        <w:rPr>
+          <w:rFonts w:ascii="Calibri" w:hAnsi="Calibri" w:eastAsia="Calibri" w:cs="Calibri"/>
+          <w:b w:val="0"/>
+          <w:i w:val="0"/>
+          <w:color w:val="000000"/>
+          <w:sz w:val="22"/>
+        </w:rPr>
+        <w:t>Java Backend Engineer with 4+ years of experience developing and supporting banking, fintech, microfinance, identity-verification, and internet-banking systems. Experienced in system design, software architecture, REST and reactive API development, database integration, debugging, testing, reporting, and production support. Contributed to 5+ production-grade platforms across banking, government, and financial-services domains. Skilled in Java, Spring Boot, Spring WebFlux, PostgreSQL R2DBC, Oracle, MySQL, multi-tenant architecture, JasperReports, Docker, and Angular.</w:t>
+      </w:r>
+    </w:p>
+    <w:p>
+      <w:pPr>
+        <w:keepNext/>
+        <w:spacing w:before="120" w:after="60" w:lineRule="exact" w:line="290"/>
+        <w:jc w:val="left"/>
+      </w:pPr>
+      <w:r>
+        <w:rPr>
+          <w:rFonts w:ascii="Calibri" w:hAnsi="Calibri" w:eastAsia="Calibri" w:cs="Calibri"/>
+          <w:b/>
+          <w:i w:val="0"/>
+          <w:color w:val="0E4661"/>
+          <w:sz w:val="25"/>
+        </w:rPr>
+        <w:t>Technical Skills</w:t>
+      </w:r>
+    </w:p>
+    <w:p>
+      <w:pPr>
+        <w:keepNext w:val="0"/>
+        <w:spacing w:before="0" w:after="0" w:lineRule="exact" w:line="260"/>
+        <w:jc w:val="left"/>
+      </w:pPr>
+      <w:r>
+        <w:rPr>
+          <w:rFonts w:ascii="Calibri" w:hAnsi="Calibri" w:eastAsia="Calibri" w:cs="Calibri"/>
+          <w:b/>
+          <w:i w:val="0"/>
+          <w:color w:val="000000"/>
+          <w:sz w:val="22"/>
+        </w:rPr>
+        <w:t>Programming Languages:</w:t>
+      </w:r>
+      <w:r>
+        <w:rPr>
+          <w:rFonts w:ascii="Calibri" w:hAnsi="Calibri" w:eastAsia="Calibri" w:cs="Calibri"/>
+          <w:b w:val="0"/>
+          <w:i w:val="0"/>
+          <w:color w:val="000000"/>
+          <w:sz w:val="22"/>
+        </w:rPr>
+        <w:t xml:space="preserve"> Java, SQL, JavaScript, TypeScript</w:t>
+      </w:r>
+    </w:p>
+    <w:p>
+      <w:pPr>
+        <w:keepNext w:val="0"/>
+        <w:spacing w:before="0" w:after="0" w:lineRule="exact" w:line="260"/>
+        <w:jc w:val="left"/>
+      </w:pPr>
+      <w:r>
+        <w:rPr>
+          <w:rFonts w:ascii="Calibri" w:hAnsi="Calibri" w:eastAsia="Calibri" w:cs="Calibri"/>
+          <w:b/>
+          <w:i w:val="0"/>
+          <w:color w:val="000000"/>
+          <w:sz w:val="22"/>
+        </w:rPr>
+        <w:t>Backend &amp; Architecture:</w:t>
+      </w:r>
+      <w:r>
+        <w:rPr>
+          <w:rFonts w:ascii="Calibri" w:hAnsi="Calibri" w:eastAsia="Calibri" w:cs="Calibri"/>
+          <w:b w:val="0"/>
+          <w:i w:val="0"/>
+          <w:color w:val="000000"/>
+          <w:sz w:val="22"/>
+        </w:rPr>
+        <w:t xml:space="preserve"> Spring Boot, WebFlux, REST APIs, microservices, system design, software architecture</w:t>
+      </w:r>
+    </w:p>
+    <w:p>
+      <w:pPr>
+        <w:keepNext w:val="0"/>
+        <w:spacing w:before="0" w:after="0" w:lineRule="exact" w:line="260"/>
+        <w:jc w:val="left"/>
+      </w:pPr>
+      <w:r>
+        <w:rPr>
+          <w:rFonts w:ascii="Calibri" w:hAnsi="Calibri" w:eastAsia="Calibri" w:cs="Calibri"/>
+          <w:b/>
+          <w:i w:val="0"/>
+          <w:color w:val="000000"/>
+          <w:sz w:val="22"/>
+        </w:rPr>
+        <w:t>Core Engineering:</w:t>
+      </w:r>
+      <w:r>
+        <w:rPr>
+          <w:rFonts w:ascii="Calibri" w:hAnsi="Calibri" w:eastAsia="Calibri" w:cs="Calibri"/>
+          <w:b w:val="0"/>
+          <w:i w:val="0"/>
+          <w:color w:val="000000"/>
+          <w:sz w:val="22"/>
+        </w:rPr>
+        <w:t xml:space="preserve"> Object-oriented programming, algorithm design, debugging, clean architecture</w:t>
+      </w:r>
+    </w:p>
+    <w:p>
+      <w:pPr>
+        <w:keepNext w:val="0"/>
+        <w:spacing w:before="0" w:after="0" w:lineRule="exact" w:line="260"/>
+        <w:jc w:val="left"/>
+      </w:pPr>
+      <w:r>
+        <w:rPr>
+          <w:rFonts w:ascii="Calibri" w:hAnsi="Calibri" w:eastAsia="Calibri" w:cs="Calibri"/>
+          <w:b/>
+          <w:i w:val="0"/>
+          <w:color w:val="000000"/>
+          <w:sz w:val="22"/>
+        </w:rPr>
+        <w:t>Data, Reporting &amp; Testing:</w:t>
+      </w:r>
+      <w:r>
+        <w:rPr>
+          <w:rFonts w:ascii="Calibri" w:hAnsi="Calibri" w:eastAsia="Calibri" w:cs="Calibri"/>
+          <w:b w:val="0"/>
+          <w:i w:val="0"/>
+          <w:color w:val="000000"/>
+          <w:sz w:val="22"/>
+        </w:rPr>
+        <w:t xml:space="preserve"> PostgreSQL, Oracle, MySQL, R2DBC, JasperReports, JUnit, Mockito</w:t>
+      </w:r>
+    </w:p>
+    <w:p>
+      <w:pPr>
+        <w:keepNext w:val="0"/>
+        <w:spacing w:before="0" w:after="0" w:lineRule="exact" w:line="260"/>
+        <w:jc w:val="left"/>
+      </w:pPr>
+      <w:r>
+        <w:rPr>
+          <w:rFonts w:ascii="Calibri" w:hAnsi="Calibri" w:eastAsia="Calibri" w:cs="Calibri"/>
+          <w:b/>
+          <w:i w:val="0"/>
+          <w:color w:val="000000"/>
+          <w:sz w:val="22"/>
+        </w:rPr>
+        <w:t>Tools, DevOps &amp; Version Control:</w:t>
+      </w:r>
+      <w:r>
+        <w:rPr>
+          <w:rFonts w:ascii="Calibri" w:hAnsi="Calibri" w:eastAsia="Calibri" w:cs="Calibri"/>
+          <w:b w:val="0"/>
+          <w:i w:val="0"/>
+          <w:color w:val="000000"/>
+          <w:sz w:val="22"/>
+        </w:rPr>
+        <w:t xml:space="preserve"> Git, GitHub, GitLab, Docker, Jenkins, Kubernetes, Trello</w:t>
+      </w:r>
+    </w:p>
+    <w:p>
+      <w:pPr>
+        <w:keepNext/>
+        <w:spacing w:before="140" w:after="60" w:lineRule="exact" w:line="290"/>
+        <w:jc w:val="left"/>
+      </w:pPr>
+      <w:r>
+        <w:rPr>
+          <w:rFonts w:ascii="Calibri" w:hAnsi="Calibri" w:eastAsia="Calibri" w:cs="Calibri"/>
+          <w:b/>
+          <w:i w:val="0"/>
+          <w:color w:val="0E4661"/>
+          <w:sz w:val="25"/>
+        </w:rPr>
+        <w:t>Work Experience</w:t>
+      </w:r>
+    </w:p>
+    <w:p>
+      <w:pPr>
+        <w:keepNext/>
+        <w:spacing w:before="0" w:after="20" w:lineRule="exact" w:line="290"/>
+        <w:jc w:val="left"/>
+      </w:pPr>
+      <w:r>
+        <w:rPr>
+          <w:rFonts w:ascii="Calibri" w:hAnsi="Calibri" w:eastAsia="Calibri" w:cs="Calibri"/>
+          <w:b w:val="0"/>
+          <w:i w:val="0"/>
+          <w:color w:val="156082"/>
+          <w:sz w:val="25"/>
+        </w:rPr>
+        <w:t>Software Developer</w:t>
+      </w:r>
+    </w:p>
+    <w:p>
+      <w:pPr>
+        <w:keepNext/>
+        <w:spacing w:before="0" w:after="40" w:lineRule="exact" w:line="264"/>
+        <w:jc w:val="left"/>
+      </w:pPr>
+      <w:r>
+        <w:rPr>
+          <w:rFonts w:ascii="Calibri" w:hAnsi="Calibri" w:eastAsia="Calibri" w:cs="Calibri"/>
+          <w:b/>
+          <w:i w:val="0"/>
+          <w:color w:val="000000"/>
+          <w:sz w:val="22"/>
+        </w:rPr>
+        <w:t>Celloscope Limited</w:t>
+      </w:r>
+      <w:r>
+        <w:rPr>
+          <w:rFonts w:ascii="Calibri" w:hAnsi="Calibri" w:eastAsia="Calibri" w:cs="Calibri"/>
+          <w:b w:val="0"/>
+          <w:i w:val="0"/>
+          <w:color w:val="000000"/>
+          <w:sz w:val="22"/>
+        </w:rPr>
+        <w:t xml:space="preserve"> | Jan 2025 – Present</w:t>
+      </w:r>
+    </w:p>
+    <w:p>
+      <w:pPr>
+        <w:keepNext w:val="0"/>
+        <w:spacing w:before="0" w:after="8" w:lineRule="exact" w:line="260"/>
+        <w:ind w:left="403" w:hanging="259"/>
+        <w:jc w:val="left"/>
+      </w:pPr>
+      <w:r>
+        <w:rPr>
+          <w:rFonts w:ascii="Calibri" w:hAnsi="Calibri" w:eastAsia="Calibri" w:cs="Calibri"/>
+          <w:b w:val="0"/>
+          <w:i w:val="0"/>
+          <w:color w:val="000000"/>
+          <w:sz w:val="17"/>
+        </w:rPr>
+        <w:t xml:space="preserve">●  </w:t>
+      </w:r>
+      <w:r>
+        <w:rPr>
+          <w:rFonts w:ascii="Calibri" w:hAnsi="Calibri" w:eastAsia="Calibri" w:cs="Calibri"/>
+          <w:b w:val="0"/>
+          <w:i w:val="0"/>
+          <w:color w:val="000000"/>
+          <w:sz w:val="22"/>
+        </w:rPr>
+        <w:t>Design and optimize RESTful and reactive Java APIs for banking and financial platforms.</w:t>
+      </w:r>
+    </w:p>
+    <w:p>
+      <w:pPr>
+        <w:keepNext w:val="0"/>
+        <w:spacing w:before="0" w:after="8" w:lineRule="exact" w:line="260"/>
+        <w:ind w:left="403" w:hanging="259"/>
+        <w:jc w:val="left"/>
+      </w:pPr>
+      <w:r>
+        <w:rPr>
+          <w:rFonts w:ascii="Calibri" w:hAnsi="Calibri" w:eastAsia="Calibri" w:cs="Calibri"/>
+          <w:b w:val="0"/>
+          <w:i w:val="0"/>
+          <w:color w:val="000000"/>
+          <w:sz w:val="17"/>
+        </w:rPr>
+        <w:t xml:space="preserve">●  </w:t>
+      </w:r>
+      <w:r>
+        <w:rPr>
+          <w:rFonts w:ascii="Calibri" w:hAnsi="Calibri" w:eastAsia="Calibri" w:cs="Calibri"/>
+          <w:b w:val="0"/>
+          <w:i w:val="0"/>
+          <w:color w:val="000000"/>
+          <w:sz w:val="22"/>
+        </w:rPr>
+        <w:t>Work with multi-tenant PostgreSQL R2DBC data access, Oracle, MySQL, and Spring Boot 3.</w:t>
+      </w:r>
+    </w:p>
+    <w:p>
+      <w:pPr>
+        <w:keepNext w:val="0"/>
+        <w:spacing w:before="0" w:after="8" w:lineRule="exact" w:line="260"/>
+        <w:ind w:left="403" w:hanging="259"/>
+        <w:jc w:val="left"/>
+      </w:pPr>
+      <w:r>
+        <w:rPr>
+          <w:rFonts w:ascii="Calibri" w:hAnsi="Calibri" w:eastAsia="Calibri" w:cs="Calibri"/>
+          <w:b w:val="0"/>
+          <w:i w:val="0"/>
+          <w:color w:val="000000"/>
+          <w:sz w:val="17"/>
+        </w:rPr>
+        <w:t xml:space="preserve">●  </w:t>
+      </w:r>
+      <w:r>
+        <w:rPr>
+          <w:rFonts w:ascii="Calibri" w:hAnsi="Calibri" w:eastAsia="Calibri" w:cs="Calibri"/>
+          <w:b w:val="0"/>
+          <w:i w:val="0"/>
+          <w:color w:val="000000"/>
+          <w:sz w:val="22"/>
+        </w:rPr>
+        <w:t>Contribute to Agrani Smart Banking workflows, integrations, JasperReports, and production support.</w:t>
+      </w:r>
+    </w:p>
+    <w:p>
+      <w:pPr>
+        <w:keepNext w:val="0"/>
+        <w:spacing w:before="0" w:after="8" w:lineRule="exact" w:line="260"/>
+        <w:ind w:left="403" w:hanging="259"/>
+        <w:jc w:val="left"/>
+      </w:pPr>
+      <w:r>
+        <w:rPr>
+          <w:rFonts w:ascii="Calibri" w:hAnsi="Calibri" w:eastAsia="Calibri" w:cs="Calibri"/>
+          <w:b w:val="0"/>
+          <w:i w:val="0"/>
+          <w:color w:val="000000"/>
+          <w:sz w:val="17"/>
+        </w:rPr>
+        <w:t xml:space="preserve">●  </w:t>
+      </w:r>
+      <w:r>
+        <w:rPr>
+          <w:rFonts w:ascii="Calibri" w:hAnsi="Calibri" w:eastAsia="Calibri" w:cs="Calibri"/>
+          <w:b w:val="0"/>
+          <w:i w:val="0"/>
+          <w:color w:val="000000"/>
+          <w:sz w:val="22"/>
+        </w:rPr>
+        <w:t>Apply system design, software architecture, debugging, and performance-focused engineering.</w:t>
+      </w:r>
+    </w:p>
+    <w:p>
+      <w:pPr>
+        <w:keepNext w:val="0"/>
+        <w:spacing w:before="0" w:after="8" w:lineRule="exact" w:line="260"/>
+        <w:ind w:left="403" w:hanging="259"/>
+        <w:jc w:val="left"/>
+      </w:pPr>
+      <w:r>
+        <w:rPr>
+          <w:rFonts w:ascii="Calibri" w:hAnsi="Calibri" w:eastAsia="Calibri" w:cs="Calibri"/>
+          <w:b w:val="0"/>
+          <w:i w:val="0"/>
+          <w:color w:val="000000"/>
+          <w:sz w:val="17"/>
+        </w:rPr>
+        <w:t xml:space="preserve">●  </w:t>
+      </w:r>
+      <w:r>
+        <w:rPr>
+          <w:rFonts w:ascii="Calibri" w:hAnsi="Calibri" w:eastAsia="Calibri" w:cs="Calibri"/>
+          <w:b w:val="0"/>
+          <w:i w:val="0"/>
+          <w:color w:val="000000"/>
+          <w:sz w:val="22"/>
+        </w:rPr>
+        <w:t>Collaborate with product, frontend, database, and QA teams to deliver reliable production releases.</w:t>
+      </w:r>
+    </w:p>
+    <w:p>
+      <w:pPr>
+        <w:keepNext/>
+        <w:spacing w:before="80" w:after="20" w:lineRule="exact" w:line="290"/>
+        <w:jc w:val="left"/>
+      </w:pPr>
+      <w:r>
+        <w:rPr>
+          <w:rFonts w:ascii="Calibri" w:hAnsi="Calibri" w:eastAsia="Calibri" w:cs="Calibri"/>
+          <w:b w:val="0"/>
+          <w:i w:val="0"/>
+          <w:color w:val="156082"/>
+          <w:sz w:val="25"/>
+        </w:rPr>
+        <w:t>Junior Software Developer</w:t>
+      </w:r>
+    </w:p>
+    <w:p>
+      <w:pPr>
+        <w:keepNext/>
+        <w:spacing w:before="0" w:after="40" w:lineRule="exact" w:line="264"/>
+        <w:jc w:val="left"/>
+      </w:pPr>
+      <w:r>
+        <w:rPr>
+          <w:rFonts w:ascii="Calibri" w:hAnsi="Calibri" w:eastAsia="Calibri" w:cs="Calibri"/>
+          <w:b/>
+          <w:i w:val="0"/>
+          <w:color w:val="000000"/>
+          <w:sz w:val="22"/>
+        </w:rPr>
+        <w:t>Celloscope Limited</w:t>
+      </w:r>
+      <w:r>
+        <w:rPr>
+          <w:rFonts w:ascii="Calibri" w:hAnsi="Calibri" w:eastAsia="Calibri" w:cs="Calibri"/>
+          <w:b w:val="0"/>
+          <w:i w:val="0"/>
+          <w:color w:val="000000"/>
+          <w:sz w:val="22"/>
+        </w:rPr>
+        <w:t xml:space="preserve"> | Dec 2022 – Dec 2024</w:t>
+      </w:r>
+    </w:p>
+    <w:p>
+      <w:pPr>
+        <w:keepNext w:val="0"/>
+        <w:spacing w:before="0" w:after="8" w:lineRule="exact" w:line="260"/>
+        <w:ind w:left="403" w:hanging="259"/>
+        <w:jc w:val="left"/>
+      </w:pPr>
+      <w:r>
+        <w:rPr>
+          <w:rFonts w:ascii="Calibri" w:hAnsi="Calibri" w:eastAsia="Calibri" w:cs="Calibri"/>
+          <w:b w:val="0"/>
+          <w:i w:val="0"/>
+          <w:color w:val="000000"/>
+          <w:sz w:val="17"/>
+        </w:rPr>
+        <w:t xml:space="preserve">●  </w:t>
+      </w:r>
+      <w:r>
+        <w:rPr>
+          <w:rFonts w:ascii="Calibri" w:hAnsi="Calibri" w:eastAsia="Calibri" w:cs="Calibri"/>
+          <w:b w:val="0"/>
+          <w:i w:val="0"/>
+          <w:color w:val="000000"/>
+          <w:sz w:val="22"/>
+        </w:rPr>
+        <w:t>Developed Java services for NRBCB Agent Banking, MRA NID Verification, and microfinance operations.</w:t>
+      </w:r>
+    </w:p>
+    <w:p>
+      <w:pPr>
+        <w:keepNext w:val="0"/>
+        <w:spacing w:before="0" w:after="8" w:lineRule="exact" w:line="260"/>
+        <w:ind w:left="403" w:hanging="259"/>
+        <w:jc w:val="left"/>
+      </w:pPr>
+      <w:r>
+        <w:rPr>
+          <w:rFonts w:ascii="Calibri" w:hAnsi="Calibri" w:eastAsia="Calibri" w:cs="Calibri"/>
+          <w:b w:val="0"/>
+          <w:i w:val="0"/>
+          <w:color w:val="000000"/>
+          <w:sz w:val="17"/>
+        </w:rPr>
+        <w:t xml:space="preserve">●  </w:t>
+      </w:r>
+      <w:r>
+        <w:rPr>
+          <w:rFonts w:ascii="Calibri" w:hAnsi="Calibri" w:eastAsia="Calibri" w:cs="Calibri"/>
+          <w:b w:val="0"/>
+          <w:i w:val="0"/>
+          <w:color w:val="000000"/>
+          <w:sz w:val="22"/>
+        </w:rPr>
+        <w:t>Built backend APIs, database workflows, JasperReports, and selected Angular features.</w:t>
+      </w:r>
+    </w:p>
+    <w:p>
+      <w:pPr>
+        <w:keepNext w:val="0"/>
+        <w:spacing w:before="0" w:after="8" w:lineRule="exact" w:line="260"/>
+        <w:ind w:left="403" w:hanging="259"/>
+        <w:jc w:val="left"/>
+      </w:pPr>
+      <w:r>
+        <w:rPr>
+          <w:rFonts w:ascii="Calibri" w:hAnsi="Calibri" w:eastAsia="Calibri" w:cs="Calibri"/>
+          <w:b w:val="0"/>
+          <w:i w:val="0"/>
+          <w:color w:val="000000"/>
+          <w:sz w:val="17"/>
+        </w:rPr>
+        <w:t xml:space="preserve">●  </w:t>
+      </w:r>
+      <w:r>
+        <w:rPr>
+          <w:rFonts w:ascii="Calibri" w:hAnsi="Calibri" w:eastAsia="Calibri" w:cs="Calibri"/>
+          <w:b w:val="0"/>
+          <w:i w:val="0"/>
+          <w:color w:val="000000"/>
+          <w:sz w:val="22"/>
+        </w:rPr>
+        <w:t>Applied object-oriented programming and algorithm design to backend workflows.</w:t>
+      </w:r>
+    </w:p>
+    <w:p>
+      <w:pPr>
+        <w:keepNext w:val="0"/>
+        <w:spacing w:before="0" w:after="8" w:lineRule="exact" w:line="260"/>
+        <w:ind w:left="403" w:hanging="259"/>
+        <w:jc w:val="left"/>
+      </w:pPr>
+      <w:r>
+        <w:rPr>
+          <w:rFonts w:ascii="Calibri" w:hAnsi="Calibri" w:eastAsia="Calibri" w:cs="Calibri"/>
+          <w:b w:val="0"/>
+          <w:i w:val="0"/>
+          <w:color w:val="000000"/>
+          <w:sz w:val="17"/>
+        </w:rPr>
+        <w:t xml:space="preserve">●  </w:t>
+      </w:r>
+      <w:r>
+        <w:rPr>
+          <w:rFonts w:ascii="Calibri" w:hAnsi="Calibri" w:eastAsia="Calibri" w:cs="Calibri"/>
+          <w:b w:val="0"/>
+          <w:i w:val="0"/>
+          <w:color w:val="000000"/>
+          <w:sz w:val="22"/>
+        </w:rPr>
+        <w:t>Investigated defects, validated data, and supported releases for live financial systems.</w:t>
+      </w:r>
+    </w:p>
+    <w:p>
+      <w:pPr>
+        <w:keepNext/>
+        <w:spacing w:before="80" w:after="20" w:lineRule="exact" w:line="290"/>
+        <w:jc w:val="left"/>
+      </w:pPr>
+      <w:r>
+        <w:rPr>
+          <w:rFonts w:ascii="Calibri" w:hAnsi="Calibri" w:eastAsia="Calibri" w:cs="Calibri"/>
+          <w:b w:val="0"/>
+          <w:i w:val="0"/>
+          <w:color w:val="156082"/>
+          <w:sz w:val="25"/>
+        </w:rPr>
+        <w:t>Assistant Software Engineer</w:t>
+      </w:r>
+    </w:p>
+    <w:p>
+      <w:pPr>
+        <w:keepNext/>
+        <w:spacing w:before="0" w:after="40" w:lineRule="exact" w:line="264"/>
+        <w:jc w:val="left"/>
+      </w:pPr>
+      <w:r>
+        <w:rPr>
+          <w:rFonts w:ascii="Calibri" w:hAnsi="Calibri" w:eastAsia="Calibri" w:cs="Calibri"/>
+          <w:b/>
+          <w:i w:val="0"/>
+          <w:color w:val="000000"/>
+          <w:sz w:val="22"/>
+        </w:rPr>
+        <w:t>Millennium Information Solution Limited</w:t>
+      </w:r>
+      <w:r>
+        <w:rPr>
+          <w:rFonts w:ascii="Calibri" w:hAnsi="Calibri" w:eastAsia="Calibri" w:cs="Calibri"/>
+          <w:b w:val="0"/>
+          <w:i w:val="0"/>
+          <w:color w:val="000000"/>
+          <w:sz w:val="22"/>
+        </w:rPr>
+        <w:t xml:space="preserve"> | May 2022 – Nov 2022</w:t>
+      </w:r>
+    </w:p>
+    <w:p>
+      <w:pPr>
+        <w:keepNext w:val="0"/>
+        <w:spacing w:before="0" w:after="8" w:lineRule="exact" w:line="260"/>
+        <w:ind w:left="403" w:hanging="259"/>
+        <w:jc w:val="left"/>
+      </w:pPr>
+      <w:r>
+        <w:rPr>
+          <w:rFonts w:ascii="Calibri" w:hAnsi="Calibri" w:eastAsia="Calibri" w:cs="Calibri"/>
+          <w:b w:val="0"/>
+          <w:i w:val="0"/>
+          <w:color w:val="000000"/>
+          <w:sz w:val="17"/>
+        </w:rPr>
+        <w:t xml:space="preserve">●  </w:t>
+      </w:r>
+      <w:r>
+        <w:rPr>
+          <w:rFonts w:ascii="Calibri" w:hAnsi="Calibri" w:eastAsia="Calibri" w:cs="Calibri"/>
+          <w:b w:val="0"/>
+          <w:i w:val="0"/>
+          <w:color w:val="000000"/>
+          <w:sz w:val="22"/>
+        </w:rPr>
+        <w:t>Performed functional and manual testing for Islamic core banking investment and loan modules.</w:t>
+      </w:r>
+    </w:p>
+    <w:p>
+      <w:pPr>
+        <w:keepNext w:val="0"/>
+        <w:spacing w:before="0" w:after="8" w:lineRule="exact" w:line="260"/>
+        <w:ind w:left="403" w:hanging="259"/>
+        <w:jc w:val="left"/>
+      </w:pPr>
+      <w:r>
+        <w:rPr>
+          <w:rFonts w:ascii="Calibri" w:hAnsi="Calibri" w:eastAsia="Calibri" w:cs="Calibri"/>
+          <w:b w:val="0"/>
+          <w:i w:val="0"/>
+          <w:color w:val="000000"/>
+          <w:sz w:val="17"/>
+        </w:rPr>
+        <w:t xml:space="preserve">●  </w:t>
+      </w:r>
+      <w:r>
+        <w:rPr>
+          <w:rFonts w:ascii="Calibri" w:hAnsi="Calibri" w:eastAsia="Calibri" w:cs="Calibri"/>
+          <w:b w:val="0"/>
+          <w:i w:val="0"/>
+          <w:color w:val="000000"/>
+          <w:sz w:val="22"/>
+        </w:rPr>
+        <w:t>Validated banking transactions, business rules, and Sharia-compliance requirements.</w:t>
+      </w:r>
+    </w:p>
+    <w:p>
+      <w:pPr>
+        <w:keepNext w:val="0"/>
+        <w:spacing w:before="0" w:after="8" w:lineRule="exact" w:line="260"/>
+        <w:ind w:left="403" w:hanging="259"/>
+        <w:jc w:val="left"/>
+      </w:pPr>
+      <w:r>
+        <w:rPr>
+          <w:rFonts w:ascii="Calibri" w:hAnsi="Calibri" w:eastAsia="Calibri" w:cs="Calibri"/>
+          <w:b w:val="0"/>
+          <w:i w:val="0"/>
+          <w:color w:val="000000"/>
+          <w:sz w:val="17"/>
+        </w:rPr>
+        <w:t xml:space="preserve">●  </w:t>
+      </w:r>
+      <w:r>
+        <w:rPr>
+          <w:rFonts w:ascii="Calibri" w:hAnsi="Calibri" w:eastAsia="Calibri" w:cs="Calibri"/>
+          <w:b w:val="0"/>
+          <w:i w:val="0"/>
+          <w:color w:val="000000"/>
+          <w:sz w:val="22"/>
+        </w:rPr>
+        <w:t>Investigated defects with Oracle and PL/SQL, documented results in Trello, and verified fixes with development teams.</w:t>
       </w:r>
     </w:p>
     <w:p>
       <w:r>
-        <w:rPr>
-          <w:b/>
-        </w:rPr>
-        <w:t>Celloscope Limited — Software Developer</w:t>
-        <w:br/>
-      </w:r>
-      <w:r>
-        <w:t>December 2022 – Present | Dhaka, Bangladesh</w:t>
+        <w:br w:type="page"/>
       </w:r>
     </w:p>
     <w:p>
       <w:pPr>
-        <w:pStyle w:val="ListBullet"/>
+        <w:keepNext/>
+        <w:spacing w:before="0" w:after="60" w:lineRule="exact" w:line="290"/>
+        <w:jc w:val="left"/>
       </w:pPr>
       <w:r>
-        <w:t>Developed and maintained reactive backend services using Java, Spring Boot, and Spring WebFlux.</w:t>
+        <w:rPr>
+          <w:rFonts w:ascii="Calibri" w:hAnsi="Calibri" w:eastAsia="Calibri" w:cs="Calibri"/>
+          <w:b/>
+          <w:i w:val="0"/>
+          <w:color w:val="0E4661"/>
+          <w:sz w:val="25"/>
+        </w:rPr>
+        <w:t>Projects</w:t>
       </w:r>
     </w:p>
     <w:p>
       <w:pPr>
-        <w:pStyle w:val="ListBullet"/>
+        <w:keepNext/>
+        <w:spacing w:before="0" w:after="20" w:lineRule="exact" w:line="260"/>
+        <w:jc w:val="left"/>
       </w:pPr>
       <w:r>
-        <w:t>Worked on NRBCB Agent Banking, NID Verification System (NVS), and MRA Microfinance projects.</w:t>
+        <w:rPr>
+          <w:rFonts w:ascii="Calibri" w:hAnsi="Calibri" w:eastAsia="Calibri" w:cs="Calibri"/>
+          <w:b/>
+          <w:i w:val="0"/>
+          <w:color w:val="000000"/>
+          <w:sz w:val="22"/>
+        </w:rPr>
+        <w:t>Banking &amp; Financial Systems:</w:t>
       </w:r>
     </w:p>
     <w:p>
       <w:pPr>
-        <w:pStyle w:val="ListBullet"/>
+        <w:keepNext w:val="0"/>
+        <w:spacing w:before="0" w:after="8" w:lineRule="exact" w:line="260"/>
+        <w:ind w:left="403" w:hanging="259"/>
+        <w:jc w:val="left"/>
       </w:pPr>
       <w:r>
-        <w:t>Implemented multi-tenant architecture with R2DBC and PostgreSQL in Spring Boot 3 applications.</w:t>
+        <w:rPr>
+          <w:rFonts w:ascii="Calibri" w:hAnsi="Calibri" w:eastAsia="Calibri" w:cs="Calibri"/>
+          <w:b w:val="0"/>
+          <w:i w:val="0"/>
+          <w:color w:val="000000"/>
+          <w:sz w:val="17"/>
+        </w:rPr>
+        <w:t xml:space="preserve">●  </w:t>
+      </w:r>
+      <w:r>
+        <w:rPr>
+          <w:rFonts w:ascii="Calibri" w:hAnsi="Calibri" w:eastAsia="Calibri" w:cs="Calibri"/>
+          <w:b w:val="0"/>
+          <w:i w:val="0"/>
+          <w:color w:val="000000"/>
+          <w:sz w:val="22"/>
+        </w:rPr>
+        <w:t>Agrani Smart Banking</w:t>
       </w:r>
     </w:p>
     <w:p>
       <w:pPr>
-        <w:pStyle w:val="ListBullet"/>
+        <w:keepNext w:val="0"/>
+        <w:spacing w:before="0" w:after="8" w:lineRule="exact" w:line="260"/>
+        <w:ind w:left="403" w:hanging="259"/>
+        <w:jc w:val="left"/>
       </w:pPr>
       <w:r>
-        <w:t>Designed and optimized RESTful APIs for high-volume financial and identity verification systems.</w:t>
+        <w:rPr>
+          <w:rFonts w:ascii="Calibri" w:hAnsi="Calibri" w:eastAsia="Calibri" w:cs="Calibri"/>
+          <w:b w:val="0"/>
+          <w:i w:val="0"/>
+          <w:color w:val="000000"/>
+          <w:sz w:val="17"/>
+        </w:rPr>
+        <w:t xml:space="preserve">●  </w:t>
+      </w:r>
+      <w:r>
+        <w:rPr>
+          <w:rFonts w:ascii="Calibri" w:hAnsi="Calibri" w:eastAsia="Calibri" w:cs="Calibri"/>
+          <w:b w:val="0"/>
+          <w:i w:val="0"/>
+          <w:color w:val="000000"/>
+          <w:sz w:val="22"/>
+        </w:rPr>
+        <w:t>Agrani Internet Banking</w:t>
       </w:r>
     </w:p>
     <w:p>
       <w:pPr>
-        <w:pStyle w:val="ListBullet"/>
+        <w:keepNext w:val="0"/>
+        <w:spacing w:before="0" w:after="8" w:lineRule="exact" w:line="260"/>
+        <w:ind w:left="403" w:hanging="259"/>
+        <w:jc w:val="left"/>
       </w:pPr>
       <w:r>
-        <w:t>Managed Oracle and PostgreSQL databases, including performance optimization and query tuning.</w:t>
+        <w:rPr>
+          <w:rFonts w:ascii="Calibri" w:hAnsi="Calibri" w:eastAsia="Calibri" w:cs="Calibri"/>
+          <w:b w:val="0"/>
+          <w:i w:val="0"/>
+          <w:color w:val="000000"/>
+          <w:sz w:val="17"/>
+        </w:rPr>
+        <w:t xml:space="preserve">●  </w:t>
+      </w:r>
+      <w:r>
+        <w:rPr>
+          <w:rFonts w:ascii="Calibri" w:hAnsi="Calibri" w:eastAsia="Calibri" w:cs="Calibri"/>
+          <w:b w:val="0"/>
+          <w:i w:val="0"/>
+          <w:color w:val="000000"/>
+          <w:sz w:val="22"/>
+        </w:rPr>
+        <w:t>Agrani Agent Banking</w:t>
       </w:r>
     </w:p>
     <w:p>
       <w:pPr>
-        <w:pStyle w:val="ListBullet"/>
+        <w:keepNext w:val="0"/>
+        <w:spacing w:before="0" w:after="8" w:lineRule="exact" w:line="260"/>
+        <w:ind w:left="403" w:hanging="259"/>
+        <w:jc w:val="left"/>
       </w:pPr>
       <w:r>
-        <w:t>Developed and maintained Jasper Reports for business and regulatory reporting requirements.</w:t>
+        <w:rPr>
+          <w:rFonts w:ascii="Calibri" w:hAnsi="Calibri" w:eastAsia="Calibri" w:cs="Calibri"/>
+          <w:b w:val="0"/>
+          <w:i w:val="0"/>
+          <w:color w:val="000000"/>
+          <w:sz w:val="17"/>
+        </w:rPr>
+        <w:t xml:space="preserve">●  </w:t>
+      </w:r>
+      <w:r>
+        <w:rPr>
+          <w:rFonts w:ascii="Calibri" w:hAnsi="Calibri" w:eastAsia="Calibri" w:cs="Calibri"/>
+          <w:b w:val="0"/>
+          <w:i w:val="0"/>
+          <w:color w:val="000000"/>
+          <w:sz w:val="22"/>
+        </w:rPr>
+        <w:t>NRBCB Agent Banking</w:t>
       </w:r>
     </w:p>
     <w:p>
       <w:pPr>
-        <w:pStyle w:val="ListBullet"/>
+        <w:keepNext w:val="0"/>
+        <w:spacing w:before="0" w:after="8" w:lineRule="exact" w:line="260"/>
+        <w:ind w:left="403" w:hanging="259"/>
+        <w:jc w:val="left"/>
       </w:pPr>
       <w:r>
-        <w:t>Worked with Docker-based deployment environments and collaborated on CI/CD workflows.</w:t>
+        <w:rPr>
+          <w:rFonts w:ascii="Calibri" w:hAnsi="Calibri" w:eastAsia="Calibri" w:cs="Calibri"/>
+          <w:b w:val="0"/>
+          <w:i w:val="0"/>
+          <w:color w:val="000000"/>
+          <w:sz w:val="17"/>
+        </w:rPr>
+        <w:t xml:space="preserve">●  </w:t>
+      </w:r>
+      <w:r>
+        <w:rPr>
+          <w:rFonts w:ascii="Calibri" w:hAnsi="Calibri" w:eastAsia="Calibri" w:cs="Calibri"/>
+          <w:b w:val="0"/>
+          <w:i w:val="0"/>
+          <w:color w:val="000000"/>
+          <w:sz w:val="22"/>
+        </w:rPr>
+        <w:t>Islamic Core Banking – Investment &amp; Loan Modules</w:t>
       </w:r>
     </w:p>
     <w:p>
       <w:pPr>
-        <w:pStyle w:val="ListBullet"/>
+        <w:keepNext/>
+        <w:spacing w:before="60" w:after="20" w:lineRule="exact" w:line="260"/>
+        <w:jc w:val="left"/>
       </w:pPr>
       <w:r>
-        <w:t>Provided production support, troubleshooting, and backend optimization for mission-critical systems.</w:t>
-      </w:r>
-    </w:p>
-    <w:p>
-      <w:r>
         <w:rPr>
+          <w:rFonts w:ascii="Calibri" w:hAnsi="Calibri" w:eastAsia="Calibri" w:cs="Calibri"/>
           <w:b/>
+          <w:i w:val="0"/>
+          <w:color w:val="000000"/>
+          <w:sz w:val="22"/>
         </w:rPr>
-        <w:t>Millennium Information Solution Ltd — Assistant Software Engineer (QA)</w:t>
-        <w:br/>
-      </w:r>
-      <w:r>
-        <w:t>May 2022 – November 2022 | Dhaka, Bangladesh</w:t>
+        <w:t>Government, Enterprise &amp; Personal Projects:</w:t>
       </w:r>
     </w:p>
     <w:p>
       <w:pPr>
-        <w:pStyle w:val="ListBullet"/>
+        <w:keepNext w:val="0"/>
+        <w:spacing w:before="0" w:after="8" w:lineRule="exact" w:line="260"/>
+        <w:ind w:left="403" w:hanging="259"/>
+        <w:jc w:val="left"/>
       </w:pPr>
       <w:r>
-        <w:t>Performed manual testing and validation for Islamic Core Banking systems.</w:t>
+        <w:rPr>
+          <w:rFonts w:ascii="Calibri" w:hAnsi="Calibri" w:eastAsia="Calibri" w:cs="Calibri"/>
+          <w:b w:val="0"/>
+          <w:i w:val="0"/>
+          <w:color w:val="000000"/>
+          <w:sz w:val="17"/>
+        </w:rPr>
+        <w:t xml:space="preserve">●  </w:t>
+      </w:r>
+      <w:r>
+        <w:rPr>
+          <w:rFonts w:ascii="Calibri" w:hAnsi="Calibri" w:eastAsia="Calibri" w:cs="Calibri"/>
+          <w:b w:val="0"/>
+          <w:i w:val="0"/>
+          <w:color w:val="000000"/>
+          <w:sz w:val="22"/>
+        </w:rPr>
+        <w:t>MRA Integrated Management System</w:t>
       </w:r>
     </w:p>
     <w:p>
       <w:pPr>
-        <w:pStyle w:val="ListBullet"/>
+        <w:keepNext w:val="0"/>
+        <w:spacing w:before="0" w:after="8" w:lineRule="exact" w:line="260"/>
+        <w:ind w:left="403" w:hanging="259"/>
+        <w:jc w:val="left"/>
       </w:pPr>
       <w:r>
-        <w:t>Ensured banking workflows complied with Sharia-compliant business rules.</w:t>
+        <w:rPr>
+          <w:rFonts w:ascii="Calibri" w:hAnsi="Calibri" w:eastAsia="Calibri" w:cs="Calibri"/>
+          <w:b w:val="0"/>
+          <w:i w:val="0"/>
+          <w:color w:val="000000"/>
+          <w:sz w:val="17"/>
+        </w:rPr>
+        <w:t xml:space="preserve">●  </w:t>
+      </w:r>
+      <w:r>
+        <w:rPr>
+          <w:rFonts w:ascii="Calibri" w:hAnsi="Calibri" w:eastAsia="Calibri" w:cs="Calibri"/>
+          <w:b w:val="0"/>
+          <w:i w:val="0"/>
+          <w:color w:val="000000"/>
+          <w:sz w:val="22"/>
+        </w:rPr>
+        <w:t>MRA NID Verification System</w:t>
       </w:r>
     </w:p>
     <w:p>
       <w:pPr>
-        <w:pStyle w:val="ListBullet"/>
+        <w:keepNext w:val="0"/>
+        <w:spacing w:before="0" w:after="8" w:lineRule="exact" w:line="260"/>
+        <w:ind w:left="403" w:hanging="259"/>
+        <w:jc w:val="left"/>
       </w:pPr>
       <w:r>
-        <w:t>Collaborated with developers to identify, reproduce, and resolve defects.</w:t>
+        <w:rPr>
+          <w:rFonts w:ascii="Calibri" w:hAnsi="Calibri" w:eastAsia="Calibri" w:cs="Calibri"/>
+          <w:b w:val="0"/>
+          <w:i w:val="0"/>
+          <w:color w:val="000000"/>
+          <w:sz w:val="17"/>
+        </w:rPr>
+        <w:t xml:space="preserve">●  </w:t>
+      </w:r>
+      <w:r>
+        <w:rPr>
+          <w:rFonts w:ascii="Calibri" w:hAnsi="Calibri" w:eastAsia="Calibri" w:cs="Calibri"/>
+          <w:b w:val="0"/>
+          <w:i w:val="0"/>
+          <w:color w:val="000000"/>
+          <w:sz w:val="22"/>
+        </w:rPr>
+        <w:t>AES Crypto WebFlux Service</w:t>
       </w:r>
     </w:p>
     <w:p>
       <w:pPr>
-        <w:pStyle w:val="ListBullet"/>
+        <w:keepNext w:val="0"/>
+        <w:spacing w:before="0" w:after="8" w:lineRule="exact" w:line="260"/>
+        <w:ind w:left="403" w:hanging="259"/>
+        <w:jc w:val="left"/>
       </w:pPr>
       <w:r>
-        <w:t>Worked with SQL, PL/SQL, Toad, and backend systems for data verification and migration.</w:t>
+        <w:rPr>
+          <w:rFonts w:ascii="Calibri" w:hAnsi="Calibri" w:eastAsia="Calibri" w:cs="Calibri"/>
+          <w:b w:val="0"/>
+          <w:i w:val="0"/>
+          <w:color w:val="000000"/>
+          <w:sz w:val="17"/>
+        </w:rPr>
+        <w:t xml:space="preserve">●  </w:t>
+      </w:r>
+      <w:r>
+        <w:rPr>
+          <w:rFonts w:ascii="Calibri" w:hAnsi="Calibri" w:eastAsia="Calibri" w:cs="Calibri"/>
+          <w:b w:val="0"/>
+          <w:i w:val="0"/>
+          <w:color w:val="000000"/>
+          <w:sz w:val="22"/>
+        </w:rPr>
+        <w:t>Invoice Management Applications – REST API, Angular &amp; Flutter</w:t>
       </w:r>
     </w:p>
     <w:p>
       <w:pPr>
-        <w:pStyle w:val="Heading1"/>
+        <w:keepNext w:val="0"/>
+        <w:spacing w:before="0" w:after="8" w:lineRule="exact" w:line="260"/>
+        <w:ind w:left="403" w:hanging="259"/>
+        <w:jc w:val="left"/>
       </w:pPr>
       <w:r>
-        <w:t>Key Projects</w:t>
+        <w:rPr>
+          <w:rFonts w:ascii="Calibri" w:hAnsi="Calibri" w:eastAsia="Calibri" w:cs="Calibri"/>
+          <w:b w:val="0"/>
+          <w:i w:val="0"/>
+          <w:color w:val="000000"/>
+          <w:sz w:val="17"/>
+        </w:rPr>
+        <w:t xml:space="preserve">●  </w:t>
       </w:r>
-    </w:p>
-    <w:p>
       <w:r>
         <w:rPr>
-          <w:b/>
+          <w:rFonts w:ascii="Calibri" w:hAnsi="Calibri" w:eastAsia="Calibri" w:cs="Calibri"/>
+          <w:b w:val="0"/>
+          <w:i w:val="0"/>
+          <w:color w:val="000000"/>
+          <w:sz w:val="22"/>
         </w:rPr>
-        <w:t xml:space="preserve">NID Verification System (NVS): </w:t>
-      </w:r>
-      <w:r>
-        <w:t>Developed backend APIs and managed database operations for national identity verification workflows.</w:t>
-      </w:r>
-    </w:p>
-    <w:p>
-      <w:r>
-        <w:rPr>
-          <w:b/>
-        </w:rPr>
-        <w:t xml:space="preserve">NRBCB Agent Banking: </w:t>
-      </w:r>
-      <w:r>
-        <w:t>Built scalable reactive banking services and reporting modules for agent banking operations.</w:t>
-      </w:r>
-    </w:p>
-    <w:p>
-      <w:r>
-        <w:rPr>
-          <w:b/>
-        </w:rPr>
-        <w:t xml:space="preserve">MRA Integrated Management System: </w:t>
-      </w:r>
-      <w:r>
-        <w:t>Implemented multi-tenant reactive backend architecture using PostgreSQL and R2DBC.</w:t>
+        <w:t>Expense Management System</w:t>
       </w:r>
     </w:p>
     <w:p>
       <w:pPr>
-        <w:pStyle w:val="Heading1"/>
+        <w:keepNext w:val="0"/>
+        <w:spacing w:before="0" w:after="8" w:lineRule="exact" w:line="260"/>
+        <w:ind w:left="403" w:hanging="259"/>
+        <w:jc w:val="left"/>
       </w:pPr>
       <w:r>
+        <w:rPr>
+          <w:rFonts w:ascii="Calibri" w:hAnsi="Calibri" w:eastAsia="Calibri" w:cs="Calibri"/>
+          <w:b w:val="0"/>
+          <w:i w:val="0"/>
+          <w:color w:val="000000"/>
+          <w:sz w:val="17"/>
+        </w:rPr>
+        <w:t xml:space="preserve">●  </w:t>
+      </w:r>
+      <w:r>
+        <w:rPr>
+          <w:rFonts w:ascii="Calibri" w:hAnsi="Calibri" w:eastAsia="Calibri" w:cs="Calibri"/>
+          <w:b w:val="0"/>
+          <w:i w:val="0"/>
+          <w:color w:val="000000"/>
+          <w:sz w:val="22"/>
+        </w:rPr>
+        <w:t>Java Reactive &amp; Concurrency Labs</w:t>
+      </w:r>
+    </w:p>
+    <w:p>
+      <w:pPr>
+        <w:keepNext w:val="0"/>
+        <w:spacing w:before="100" w:after="60" w:lineRule="exact" w:line="264"/>
+        <w:jc w:val="both"/>
+      </w:pPr>
+      <w:r>
+        <w:rPr>
+          <w:rFonts w:ascii="Calibri" w:hAnsi="Calibri" w:eastAsia="Calibri" w:cs="Calibri"/>
+          <w:b w:val="0"/>
+          <w:i/>
+          <w:color w:val="000000"/>
+          <w:sz w:val="22"/>
+        </w:rPr>
+        <w:t>Role: Backend Engineering including Requirement Analysis, REST and Reactive API Development, Multi-tenant Architecture, Database Integration, Jasper Reporting, Testing, Deployment Support, Production Support, and Cross-functional Collaboration.</w:t>
+      </w:r>
+    </w:p>
+    <w:p>
+      <w:pPr>
+        <w:keepNext/>
+        <w:spacing w:before="100" w:after="60" w:lineRule="exact" w:line="290"/>
+        <w:jc w:val="left"/>
+      </w:pPr>
+      <w:r>
+        <w:rPr>
+          <w:rFonts w:ascii="Calibri" w:hAnsi="Calibri" w:eastAsia="Calibri" w:cs="Calibri"/>
+          <w:b/>
+          <w:i w:val="0"/>
+          <w:color w:val="0E4661"/>
+          <w:sz w:val="25"/>
+        </w:rPr>
         <w:t>Education</w:t>
       </w:r>
     </w:p>
     <w:p>
       <w:pPr>
-        <w:pStyle w:val="ListBullet"/>
+        <w:keepNext/>
+        <w:spacing w:before="40" w:after="0" w:lineRule="exact" w:line="260"/>
+        <w:jc w:val="left"/>
       </w:pPr>
       <w:r>
-        <w:t>MSc in Computer Science &amp; Engineering — Islamic University of Kushtia (2025)</w:t>
+        <w:rPr>
+          <w:rFonts w:ascii="Calibri" w:hAnsi="Calibri" w:eastAsia="Calibri" w:cs="Calibri"/>
+          <w:b/>
+          <w:i w:val="0"/>
+          <w:color w:val="000000"/>
+          <w:sz w:val="22"/>
+        </w:rPr>
+        <w:t>Master of Science in Computer Science &amp; Engineering</w:t>
       </w:r>
     </w:p>
     <w:p>
       <w:pPr>
-        <w:pStyle w:val="ListBullet"/>
+        <w:keepNext/>
+        <w:spacing w:before="0" w:after="0" w:lineRule="exact" w:line="260"/>
+        <w:jc w:val="left"/>
       </w:pPr>
       <w:r>
-        <w:t>Diploma in Enterprise Systems Analysis &amp; Design (J2EE) — IsDB-BISEW</w:t>
+        <w:rPr>
+          <w:rFonts w:ascii="Calibri" w:hAnsi="Calibri" w:eastAsia="Calibri" w:cs="Calibri"/>
+          <w:b w:val="0"/>
+          <w:i w:val="0"/>
+          <w:color w:val="000000"/>
+          <w:sz w:val="22"/>
+        </w:rPr>
+        <w:t>Islamic University, Kushtia</w:t>
       </w:r>
     </w:p>
     <w:p>
       <w:pPr>
-        <w:pStyle w:val="ListBullet"/>
+        <w:keepNext w:val="0"/>
+        <w:spacing w:before="0" w:after="40" w:lineRule="exact" w:line="260"/>
+        <w:jc w:val="left"/>
       </w:pPr>
       <w:r>
-        <w:t>MSc — National University (2019)</w:t>
+        <w:rPr>
+          <w:rFonts w:ascii="Calibri" w:hAnsi="Calibri" w:eastAsia="Calibri" w:cs="Calibri"/>
+          <w:b w:val="0"/>
+          <w:i w:val="0"/>
+          <w:color w:val="000000"/>
+          <w:sz w:val="22"/>
+        </w:rPr>
+        <w:t>Completed | 2025</w:t>
       </w:r>
     </w:p>
     <w:p>
       <w:pPr>
-        <w:pStyle w:val="ListBullet"/>
+        <w:keepNext/>
+        <w:spacing w:before="40" w:after="0" w:lineRule="exact" w:line="260"/>
+        <w:jc w:val="left"/>
       </w:pPr>
       <w:r>
-        <w:t>BSc — National University (2018)</w:t>
+        <w:rPr>
+          <w:rFonts w:ascii="Calibri" w:hAnsi="Calibri" w:eastAsia="Calibri" w:cs="Calibri"/>
+          <w:b/>
+          <w:i w:val="0"/>
+          <w:color w:val="000000"/>
+          <w:sz w:val="22"/>
+        </w:rPr>
+        <w:t>Master of Science in Entomology</w:t>
       </w:r>
     </w:p>
     <w:p>
       <w:pPr>
-        <w:pStyle w:val="Heading1"/>
+        <w:keepNext/>
+        <w:spacing w:before="0" w:after="0" w:lineRule="exact" w:line="260"/>
+        <w:jc w:val="left"/>
       </w:pPr>
       <w:r>
-        <w:t>Certifications</w:t>
+        <w:rPr>
+          <w:rFonts w:ascii="Calibri" w:hAnsi="Calibri" w:eastAsia="Calibri" w:cs="Calibri"/>
+          <w:b w:val="0"/>
+          <w:i w:val="0"/>
+          <w:color w:val="000000"/>
+          <w:sz w:val="22"/>
+        </w:rPr>
+        <w:t>National University</w:t>
       </w:r>
     </w:p>
     <w:p>
       <w:pPr>
-        <w:pStyle w:val="ListBullet"/>
+        <w:keepNext w:val="0"/>
+        <w:spacing w:before="0" w:after="40" w:lineRule="exact" w:line="260"/>
+        <w:jc w:val="left"/>
       </w:pPr>
       <w:r>
-        <w:t>Diploma in Enterprise Systems Analysis &amp; Design (J2EE) — IsDB-BISEW</w:t>
+        <w:rPr>
+          <w:rFonts w:ascii="Calibri" w:hAnsi="Calibri" w:eastAsia="Calibri" w:cs="Calibri"/>
+          <w:b w:val="0"/>
+          <w:i w:val="0"/>
+          <w:color w:val="000000"/>
+          <w:sz w:val="22"/>
+        </w:rPr>
+        <w:t>Completed | 2019</w:t>
       </w:r>
     </w:p>
     <w:p>
       <w:pPr>
-        <w:pStyle w:val="ListBullet"/>
+        <w:keepNext/>
+        <w:spacing w:before="40" w:after="0" w:lineRule="exact" w:line="260"/>
+        <w:jc w:val="left"/>
       </w:pPr>
       <w:r>
-        <w:t>C# .NET — Digicon Technologies Limited</w:t>
+        <w:rPr>
+          <w:rFonts w:ascii="Calibri" w:hAnsi="Calibri" w:eastAsia="Calibri" w:cs="Calibri"/>
+          <w:b/>
+          <w:i w:val="0"/>
+          <w:color w:val="000000"/>
+          <w:sz w:val="22"/>
+        </w:rPr>
+        <w:t>Bachelor of Science in Zoology</w:t>
+      </w:r>
+    </w:p>
+    <w:p>
+      <w:pPr>
+        <w:keepNext/>
+        <w:spacing w:before="0" w:after="0" w:lineRule="exact" w:line="260"/>
+        <w:jc w:val="left"/>
+      </w:pPr>
+      <w:r>
+        <w:rPr>
+          <w:rFonts w:ascii="Calibri" w:hAnsi="Calibri" w:eastAsia="Calibri" w:cs="Calibri"/>
+          <w:b w:val="0"/>
+          <w:i w:val="0"/>
+          <w:color w:val="000000"/>
+          <w:sz w:val="22"/>
+        </w:rPr>
+        <w:t>National University</w:t>
+      </w:r>
+    </w:p>
+    <w:p>
+      <w:pPr>
+        <w:keepNext w:val="0"/>
+        <w:spacing w:before="0" w:after="40" w:lineRule="exact" w:line="260"/>
+        <w:jc w:val="left"/>
+      </w:pPr>
+      <w:r>
+        <w:rPr>
+          <w:rFonts w:ascii="Calibri" w:hAnsi="Calibri" w:eastAsia="Calibri" w:cs="Calibri"/>
+          <w:b w:val="0"/>
+          <w:i w:val="0"/>
+          <w:color w:val="000000"/>
+          <w:sz w:val="22"/>
+        </w:rPr>
+        <w:t>Completed | 2018</w:t>
+      </w:r>
+    </w:p>
+    <w:p>
+      <w:pPr>
+        <w:keepNext/>
+        <w:spacing w:before="120" w:after="60" w:lineRule="exact" w:line="290"/>
+        <w:jc w:val="left"/>
+      </w:pPr>
+      <w:r>
+        <w:rPr>
+          <w:rFonts w:ascii="Calibri" w:hAnsi="Calibri" w:eastAsia="Calibri" w:cs="Calibri"/>
+          <w:b/>
+          <w:i w:val="0"/>
+          <w:color w:val="0E4661"/>
+          <w:sz w:val="25"/>
+        </w:rPr>
+        <w:t>Professional Training</w:t>
+      </w:r>
+    </w:p>
+    <w:p>
+      <w:pPr>
+        <w:keepNext/>
+        <w:spacing w:before="40" w:after="0" w:lineRule="exact" w:line="260"/>
+        <w:jc w:val="left"/>
+      </w:pPr>
+      <w:r>
+        <w:rPr>
+          <w:rFonts w:ascii="Calibri" w:hAnsi="Calibri" w:eastAsia="Calibri" w:cs="Calibri"/>
+          <w:b/>
+          <w:i w:val="0"/>
+          <w:color w:val="000000"/>
+          <w:sz w:val="22"/>
+        </w:rPr>
+        <w:t>Diploma in Enterprise Systems Analysis &amp; Design – JEE (ESAD-JEE)</w:t>
+      </w:r>
+    </w:p>
+    <w:p>
+      <w:pPr>
+        <w:keepNext w:val="0"/>
+        <w:spacing w:before="0" w:after="40" w:lineRule="exact" w:line="260"/>
+        <w:jc w:val="left"/>
+      </w:pPr>
+      <w:r>
+        <w:rPr>
+          <w:rFonts w:ascii="Calibri" w:hAnsi="Calibri" w:eastAsia="Calibri" w:cs="Calibri"/>
+          <w:b w:val="0"/>
+          <w:i w:val="0"/>
+          <w:color w:val="000000"/>
+          <w:sz w:val="22"/>
+        </w:rPr>
+        <w:t>IsDB-BISEW IT Scholarship Programme, Dhaka | Dec 2020 – Apr 2022</w:t>
+      </w:r>
+    </w:p>
+    <w:p>
+      <w:pPr>
+        <w:keepNext/>
+        <w:spacing w:before="40" w:after="0" w:lineRule="exact" w:line="260"/>
+        <w:jc w:val="left"/>
+      </w:pPr>
+      <w:r>
+        <w:rPr>
+          <w:rFonts w:ascii="Calibri" w:hAnsi="Calibri" w:eastAsia="Calibri" w:cs="Calibri"/>
+          <w:b/>
+          <w:i w:val="0"/>
+          <w:color w:val="000000"/>
+          <w:sz w:val="22"/>
+        </w:rPr>
+        <w:t>C# .NET</w:t>
+      </w:r>
+    </w:p>
+    <w:p>
+      <w:pPr>
+        <w:keepNext w:val="0"/>
+        <w:spacing w:before="0" w:after="40" w:lineRule="exact" w:line="260"/>
+        <w:jc w:val="left"/>
+      </w:pPr>
+      <w:r>
+        <w:rPr>
+          <w:rFonts w:ascii="Calibri" w:hAnsi="Calibri" w:eastAsia="Calibri" w:cs="Calibri"/>
+          <w:b w:val="0"/>
+          <w:i w:val="0"/>
+          <w:color w:val="000000"/>
+          <w:sz w:val="22"/>
+        </w:rPr>
+        <w:t>Digicon Technologies Limited | Sep 2022 – Feb 2023</w:t>
+      </w:r>
+    </w:p>
+    <w:p>
+      <w:pPr>
+        <w:keepNext/>
+        <w:spacing w:before="120" w:after="60" w:lineRule="exact" w:line="290"/>
+        <w:jc w:val="left"/>
+      </w:pPr>
+      <w:r>
+        <w:rPr>
+          <w:rFonts w:ascii="Calibri" w:hAnsi="Calibri" w:eastAsia="Calibri" w:cs="Calibri"/>
+          <w:b/>
+          <w:i w:val="0"/>
+          <w:color w:val="0E4661"/>
+          <w:sz w:val="25"/>
+        </w:rPr>
+        <w:t>Key Strengths</w:t>
+      </w:r>
+    </w:p>
+    <w:p>
+      <w:pPr>
+        <w:keepNext w:val="0"/>
+        <w:spacing w:before="0" w:after="4" w:lineRule="exact" w:line="260"/>
+        <w:ind w:left="403" w:hanging="259"/>
+        <w:jc w:val="left"/>
+      </w:pPr>
+      <w:r>
+        <w:rPr>
+          <w:rFonts w:ascii="Calibri" w:hAnsi="Calibri" w:eastAsia="Calibri" w:cs="Calibri"/>
+          <w:b w:val="0"/>
+          <w:i w:val="0"/>
+          <w:color w:val="000000"/>
+          <w:sz w:val="17"/>
+        </w:rPr>
+        <w:t xml:space="preserve">●  </w:t>
+      </w:r>
+      <w:r>
+        <w:rPr>
+          <w:rFonts w:ascii="Calibri" w:hAnsi="Calibri" w:eastAsia="Calibri" w:cs="Calibri"/>
+          <w:b w:val="0"/>
+          <w:i w:val="0"/>
+          <w:color w:val="000000"/>
+          <w:sz w:val="22"/>
+        </w:rPr>
+        <w:t>End-to-end backend ownership (Requirement → Design → Development → Testing → Support).</w:t>
+      </w:r>
+    </w:p>
+    <w:p>
+      <w:pPr>
+        <w:keepNext w:val="0"/>
+        <w:spacing w:before="0" w:after="4" w:lineRule="exact" w:line="260"/>
+        <w:ind w:left="403" w:hanging="259"/>
+        <w:jc w:val="left"/>
+      </w:pPr>
+      <w:r>
+        <w:rPr>
+          <w:rFonts w:ascii="Calibri" w:hAnsi="Calibri" w:eastAsia="Calibri" w:cs="Calibri"/>
+          <w:b w:val="0"/>
+          <w:i w:val="0"/>
+          <w:color w:val="000000"/>
+          <w:sz w:val="17"/>
+        </w:rPr>
+        <w:t xml:space="preserve">●  </w:t>
+      </w:r>
+      <w:r>
+        <w:rPr>
+          <w:rFonts w:ascii="Calibri" w:hAnsi="Calibri" w:eastAsia="Calibri" w:cs="Calibri"/>
+          <w:b w:val="0"/>
+          <w:i w:val="0"/>
+          <w:color w:val="000000"/>
+          <w:sz w:val="22"/>
+        </w:rPr>
+        <w:t>Java backend development with Spring Boot, Spring WebFlux, and reactive programming.</w:t>
+      </w:r>
+    </w:p>
+    <w:p>
+      <w:pPr>
+        <w:keepNext w:val="0"/>
+        <w:spacing w:before="0" w:after="4" w:lineRule="exact" w:line="260"/>
+        <w:ind w:left="403" w:hanging="259"/>
+        <w:jc w:val="left"/>
+      </w:pPr>
+      <w:r>
+        <w:rPr>
+          <w:rFonts w:ascii="Calibri" w:hAnsi="Calibri" w:eastAsia="Calibri" w:cs="Calibri"/>
+          <w:b w:val="0"/>
+          <w:i w:val="0"/>
+          <w:color w:val="000000"/>
+          <w:sz w:val="17"/>
+        </w:rPr>
+        <w:t xml:space="preserve">●  </w:t>
+      </w:r>
+      <w:r>
+        <w:rPr>
+          <w:rFonts w:ascii="Calibri" w:hAnsi="Calibri" w:eastAsia="Calibri" w:cs="Calibri"/>
+          <w:b w:val="0"/>
+          <w:i w:val="0"/>
+          <w:color w:val="000000"/>
+          <w:sz w:val="22"/>
+        </w:rPr>
+        <w:t>Banking and fintech domain expertise across agent banking, internet banking, and core banking.</w:t>
+      </w:r>
+    </w:p>
+    <w:p>
+      <w:pPr>
+        <w:keepNext w:val="0"/>
+        <w:spacing w:before="0" w:after="4" w:lineRule="exact" w:line="260"/>
+        <w:ind w:left="403" w:hanging="259"/>
+        <w:jc w:val="left"/>
+      </w:pPr>
+      <w:r>
+        <w:rPr>
+          <w:rFonts w:ascii="Calibri" w:hAnsi="Calibri" w:eastAsia="Calibri" w:cs="Calibri"/>
+          <w:b w:val="0"/>
+          <w:i w:val="0"/>
+          <w:color w:val="000000"/>
+          <w:sz w:val="17"/>
+        </w:rPr>
+        <w:t xml:space="preserve">●  </w:t>
+      </w:r>
+      <w:r>
+        <w:rPr>
+          <w:rFonts w:ascii="Calibri" w:hAnsi="Calibri" w:eastAsia="Calibri" w:cs="Calibri"/>
+          <w:b w:val="0"/>
+          <w:i w:val="0"/>
+          <w:color w:val="000000"/>
+          <w:sz w:val="22"/>
+        </w:rPr>
+        <w:t>Multi-tenant architecture with PostgreSQL R2DBC and Spring Boot 3.</w:t>
+      </w:r>
+    </w:p>
+    <w:p>
+      <w:pPr>
+        <w:keepNext w:val="0"/>
+        <w:spacing w:before="0" w:after="4" w:lineRule="exact" w:line="260"/>
+        <w:ind w:left="403" w:hanging="259"/>
+        <w:jc w:val="left"/>
+      </w:pPr>
+      <w:r>
+        <w:rPr>
+          <w:rFonts w:ascii="Calibri" w:hAnsi="Calibri" w:eastAsia="Calibri" w:cs="Calibri"/>
+          <w:b w:val="0"/>
+          <w:i w:val="0"/>
+          <w:color w:val="000000"/>
+          <w:sz w:val="17"/>
+        </w:rPr>
+        <w:t xml:space="preserve">●  </w:t>
+      </w:r>
+      <w:r>
+        <w:rPr>
+          <w:rFonts w:ascii="Calibri" w:hAnsi="Calibri" w:eastAsia="Calibri" w:cs="Calibri"/>
+          <w:b w:val="0"/>
+          <w:i w:val="0"/>
+          <w:color w:val="000000"/>
+          <w:sz w:val="22"/>
+        </w:rPr>
+        <w:t>System design, software architecture, microservices, clean architecture, and system integration.</w:t>
+      </w:r>
+    </w:p>
+    <w:p>
+      <w:pPr>
+        <w:keepNext w:val="0"/>
+        <w:spacing w:before="0" w:after="4" w:lineRule="exact" w:line="260"/>
+        <w:ind w:left="403" w:hanging="259"/>
+        <w:jc w:val="left"/>
+      </w:pPr>
+      <w:r>
+        <w:rPr>
+          <w:rFonts w:ascii="Calibri" w:hAnsi="Calibri" w:eastAsia="Calibri" w:cs="Calibri"/>
+          <w:b w:val="0"/>
+          <w:i w:val="0"/>
+          <w:color w:val="000000"/>
+          <w:sz w:val="17"/>
+        </w:rPr>
+        <w:t xml:space="preserve">●  </w:t>
+      </w:r>
+      <w:r>
+        <w:rPr>
+          <w:rFonts w:ascii="Calibri" w:hAnsi="Calibri" w:eastAsia="Calibri" w:cs="Calibri"/>
+          <w:b w:val="0"/>
+          <w:i w:val="0"/>
+          <w:color w:val="000000"/>
+          <w:sz w:val="22"/>
+        </w:rPr>
+        <w:t>Database integration, SQL analysis, data validation, and performance-focused development.</w:t>
+      </w:r>
+    </w:p>
+    <w:p>
+      <w:pPr>
+        <w:keepNext w:val="0"/>
+        <w:spacing w:before="0" w:after="4" w:lineRule="exact" w:line="260"/>
+        <w:ind w:left="403" w:hanging="259"/>
+        <w:jc w:val="left"/>
+      </w:pPr>
+      <w:r>
+        <w:rPr>
+          <w:rFonts w:ascii="Calibri" w:hAnsi="Calibri" w:eastAsia="Calibri" w:cs="Calibri"/>
+          <w:b w:val="0"/>
+          <w:i w:val="0"/>
+          <w:color w:val="000000"/>
+          <w:sz w:val="17"/>
+        </w:rPr>
+        <w:t xml:space="preserve">●  </w:t>
+      </w:r>
+      <w:r>
+        <w:rPr>
+          <w:rFonts w:ascii="Calibri" w:hAnsi="Calibri" w:eastAsia="Calibri" w:cs="Calibri"/>
+          <w:b w:val="0"/>
+          <w:i w:val="0"/>
+          <w:color w:val="000000"/>
+          <w:sz w:val="22"/>
+        </w:rPr>
+        <w:t>JasperReports and regulatory reporting for production financial platforms.</w:t>
+      </w:r>
+    </w:p>
+    <w:p>
+      <w:pPr>
+        <w:keepNext w:val="0"/>
+        <w:spacing w:before="0" w:after="4" w:lineRule="exact" w:line="260"/>
+        <w:ind w:left="403" w:hanging="259"/>
+        <w:jc w:val="left"/>
+      </w:pPr>
+      <w:r>
+        <w:rPr>
+          <w:rFonts w:ascii="Calibri" w:hAnsi="Calibri" w:eastAsia="Calibri" w:cs="Calibri"/>
+          <w:b w:val="0"/>
+          <w:i w:val="0"/>
+          <w:color w:val="000000"/>
+          <w:sz w:val="17"/>
+        </w:rPr>
+        <w:t xml:space="preserve">●  </w:t>
+      </w:r>
+      <w:r>
+        <w:rPr>
+          <w:rFonts w:ascii="Calibri" w:hAnsi="Calibri" w:eastAsia="Calibri" w:cs="Calibri"/>
+          <w:b w:val="0"/>
+          <w:i w:val="0"/>
+          <w:color w:val="000000"/>
+          <w:sz w:val="22"/>
+        </w:rPr>
+        <w:t>Production support, incident troubleshooting, defect investigation, and release validation.</w:t>
+      </w:r>
+    </w:p>
+    <w:p>
+      <w:pPr>
+        <w:keepNext w:val="0"/>
+        <w:spacing w:before="0" w:after="4" w:lineRule="exact" w:line="260"/>
+        <w:ind w:left="403" w:hanging="259"/>
+        <w:jc w:val="left"/>
+      </w:pPr>
+      <w:r>
+        <w:rPr>
+          <w:rFonts w:ascii="Calibri" w:hAnsi="Calibri" w:eastAsia="Calibri" w:cs="Calibri"/>
+          <w:b w:val="0"/>
+          <w:i w:val="0"/>
+          <w:color w:val="000000"/>
+          <w:sz w:val="17"/>
+        </w:rPr>
+        <w:t xml:space="preserve">●  </w:t>
+      </w:r>
+      <w:r>
+        <w:rPr>
+          <w:rFonts w:ascii="Calibri" w:hAnsi="Calibri" w:eastAsia="Calibri" w:cs="Calibri"/>
+          <w:b w:val="0"/>
+          <w:i w:val="0"/>
+          <w:color w:val="000000"/>
+          <w:sz w:val="22"/>
+        </w:rPr>
+        <w:t>Object-oriented programming, algorithm design, debugging, and cross-functional collaboration.</w:t>
+      </w:r>
+    </w:p>
+    <w:p>
+      <w:pPr>
+        <w:keepNext w:val="0"/>
+        <w:spacing w:before="0" w:after="4" w:lineRule="exact" w:line="260"/>
+        <w:ind w:left="403" w:hanging="259"/>
+        <w:jc w:val="left"/>
+      </w:pPr>
+      <w:r>
+        <w:rPr>
+          <w:rFonts w:ascii="Calibri" w:hAnsi="Calibri" w:eastAsia="Calibri" w:cs="Calibri"/>
+          <w:b w:val="0"/>
+          <w:i w:val="0"/>
+          <w:color w:val="000000"/>
+          <w:sz w:val="17"/>
+        </w:rPr>
+        <w:t xml:space="preserve">●  </w:t>
+      </w:r>
+      <w:r>
+        <w:rPr>
+          <w:rFonts w:ascii="Calibri" w:hAnsi="Calibri" w:eastAsia="Calibri" w:cs="Calibri"/>
+          <w:b w:val="0"/>
+          <w:i w:val="0"/>
+          <w:color w:val="000000"/>
+          <w:sz w:val="22"/>
+        </w:rPr>
+        <w:t>Applied security, Java concurrency, and reactive-system learning through public projects.</w:t>
+      </w:r>
+    </w:p>
+    <w:p>
+      <w:pPr>
+        <w:keepNext w:val="0"/>
+        <w:spacing w:before="0" w:after="4" w:lineRule="exact" w:line="260"/>
+        <w:ind w:left="403" w:hanging="259"/>
+        <w:jc w:val="left"/>
+      </w:pPr>
+      <w:r>
+        <w:rPr>
+          <w:rFonts w:ascii="Calibri" w:hAnsi="Calibri" w:eastAsia="Calibri" w:cs="Calibri"/>
+          <w:b w:val="0"/>
+          <w:i w:val="0"/>
+          <w:color w:val="000000"/>
+          <w:sz w:val="17"/>
+        </w:rPr>
+        <w:t xml:space="preserve">●  </w:t>
+      </w:r>
+      <w:r>
+        <w:rPr>
+          <w:rFonts w:ascii="Calibri" w:hAnsi="Calibri" w:eastAsia="Calibri" w:cs="Calibri"/>
+          <w:b w:val="0"/>
+          <w:i w:val="0"/>
+          <w:color w:val="000000"/>
+          <w:sz w:val="22"/>
+        </w:rPr>
+        <w:t>AI-assisted engineering and agentic workflow learning for developer productivity.</w:t>
       </w:r>
     </w:p>
     <w:sectPr>
       <w:pgSz w:w="12240" w:h="15840"/>
-      <w:pgMar w:top="1440" w:right="1800" w:bottom="1440" w:left="1800" w:header="720" w:footer="720" w:gutter="0"/>
+      <w:pgMar w:top="792" w:right="893" w:bottom="792" w:left="893" w:header="216" w:footer="216" w:gutter="0"/>
       <w:cols w:space="720"/>
       <w:docGrid w:linePitch="360"/>
     </w:sectPr>
@@ -862,6 +2529,10 @@
     <w:name w:val="Normal"/>
     <w:qFormat/>
     <w:rsid w:val="00FC693F"/>
+    <w:rPr>
+      <w:rFonts w:ascii="Calibri" w:hAnsi="Calibri"/>
+      <w:sz w:val="22"/>
+    </w:rPr>
   </w:style>
   <w:style w:type="paragraph" w:styleId="Header">
     <w:name w:val="header"/>

</xml_diff>

<commit_message>
update: update the layout
</commit_message>
<xml_diff>
--- a/assets/docs/Mehedi_Hasan_Resume.docx
+++ b/assets/docs/Mehedi_Hasan_Resume.docx
@@ -315,7 +315,7 @@
                   <w:szCs w:val="22"/>
                   <w:u w:val="none"/>
                 </w:rPr>
-                <w:t>https://www.linkedin.com/in/mehedisoft/</w:t>
+                <w:t>https://www.linkedin.com/in/mehedi-hasan-medu/</w:t>
               </w:r>
             </w:hyperlink>
           </w:p>
@@ -555,7 +555,7 @@
           <w:color w:val="000000"/>
           <w:sz w:val="22"/>
         </w:rPr>
-        <w:t>Java Backend Engineer with 4+ years of experience developing and supporting banking, fintech, microfinance, identity-verification, and internet-banking systems. Experienced in system design, software architecture, REST and reactive API development, database integration, debugging, testing, reporting, and production support. Contributed to 5+ production-grade platforms across banking, government, and financial-services domains. Skilled in Java, Spring Boot, Spring WebFlux, PostgreSQL R2DBC, Oracle, MySQL, multi-tenant architecture, JasperReports, Docker, and Angular.</w:t>
+        <w:t>Java Backend Engineer with 4+ years of experience developing and supporting banking, fintech, microfinance, identity-verification, and internet-banking systems. Experienced in system design, software architecture, REST and reactive API development, database integration, debugging, testing, reporting, and production support. Contributed to 7+ production-grade platforms across banking, government, and financial-services domains. Skilled in Java, Spring Boot, Spring WebFlux, PostgreSQL R2DBC, Oracle, MySQL, multi-tenant architecture, JasperReports, Docker, and Angular.</w:t>
       </w:r>
     </w:p>
     <w:p>

</xml_diff>